<commit_message>
Cap nhat loai bo hoan toan dang bang (table) trong file Word de thi Hoa 12 Ma 485
</commit_message>
<xml_diff>
--- a/San_Pham/De_Kiem_Tra_Hoa_12_Ma485.docx
+++ b/San_Pham/De_Kiem_Tra_Hoa_12_Ma485.docx
@@ -2,104 +2,138 @@
 <file path=word/document.xml><?xml version="1.0" encoding="utf-8"?>
 <w:document xmlns:wpc="http://schemas.microsoft.com/office/word/2010/wordprocessingCanvas" xmlns:mo="http://schemas.microsoft.com/office/mac/office/2008/main" xmlns:mc="http://schemas.openxmlformats.org/markup-compatibility/2006" xmlns:mv="urn:schemas-microsoft-com:mac:vml" xmlns:o="urn:schemas-microsoft-com:office:office" xmlns:r="http://schemas.openxmlformats.org/officeDocument/2006/relationships" xmlns:m="http://schemas.openxmlformats.org/officeDocument/2006/math" xmlns:v="urn:schemas-microsoft-com:vml" xmlns:wp14="http://schemas.microsoft.com/office/word/2010/wordprocessingDrawing" xmlns:wp="http://schemas.openxmlformats.org/drawingml/2006/wordprocessingDrawing" xmlns:w10="urn:schemas-microsoft-com:office:word" xmlns:w="http://schemas.openxmlformats.org/wordprocessingml/2006/main" xmlns:w14="http://schemas.microsoft.com/office/word/2010/wordml" xmlns:wpg="http://schemas.microsoft.com/office/word/2010/wordprocessingGroup" xmlns:wpi="http://schemas.microsoft.com/office/word/2010/wordprocessingInk" xmlns:wne="http://schemas.microsoft.com/office/word/2006/wordml" xmlns:wps="http://schemas.microsoft.com/office/word/2010/wordprocessingShape" mc:Ignorable="w14 wp14">
   <w:body>
-    <w:tbl>
-      <w:tblPr>
-        <w:tblW w:type="auto" w:w="0"/>
-        <w:jc w:val="center"/>
-        <w:tblLayout w:type="fixed"/>
-        <w:tblLook w:firstColumn="1" w:firstRow="1" w:lastColumn="0" w:lastRow="0" w:noHBand="0" w:noVBand="1" w:val="04A0"/>
-      </w:tblPr>
-      <w:tblGrid>
-        <w:gridCol w:w="5103"/>
-        <w:gridCol w:w="5103"/>
-      </w:tblGrid>
-      <w:tr>
-        <w:tc>
-          <w:tcPr>
-            <w:tcW w:type="dxa" w:w="4252"/>
-          </w:tcPr>
-          <w:p>
-            <w:pPr>
-              <w:spacing w:before="0" w:after="20"/>
-              <w:jc w:val="center"/>
-            </w:pPr>
-            <w:r>
-              <w:rPr>
-                <w:rFonts w:ascii="Times New Roman" w:hAnsi="Times New Roman"/>
-                <w:b/>
-                <w:i w:val="0"/>
-                <w:sz w:val="21"/>
-              </w:rPr>
-              <w:t>SỞ GD &amp; ĐT THÀNH PHỐ HUẾ</w:t>
-              <w:br/>
-              <w:t>TRƯỜNG THPT HOÁ CHÂU</w:t>
-              <w:br/>
-            </w:r>
-            <w:r>
-              <w:rPr>
-                <w:rFonts w:ascii="Times New Roman" w:hAnsi="Times New Roman"/>
-                <w:b/>
-                <w:i w:val="0"/>
-                <w:sz w:val="21"/>
-              </w:rPr>
-              <w:t>ĐỀ CHÍNH THỨC</w:t>
-              <w:br/>
-            </w:r>
-            <w:r>
-              <w:rPr>
-                <w:rFonts w:ascii="Times New Roman" w:hAnsi="Times New Roman"/>
-                <w:b w:val="0"/>
-                <w:i/>
-                <w:sz w:val="20"/>
-              </w:rPr>
-              <w:t>(Đề gồm có 03 trang)</w:t>
-            </w:r>
-          </w:p>
-        </w:tc>
-        <w:tc>
-          <w:tcPr>
-            <w:tcW w:type="dxa" w:w="5953"/>
-          </w:tcPr>
-          <w:p>
-            <w:pPr>
-              <w:spacing w:before="0" w:after="20"/>
-              <w:jc w:val="center"/>
-            </w:pPr>
-            <w:r>
-              <w:rPr>
-                <w:rFonts w:ascii="Times New Roman" w:hAnsi="Times New Roman"/>
-                <w:b/>
-                <w:i w:val="0"/>
-                <w:sz w:val="22"/>
-              </w:rPr>
-              <w:t>ĐỀ KIỂM TRA GIỮA HỌC KÌ I – NĂM HỌC 2025-2026</w:t>
-              <w:br/>
-            </w:r>
-            <w:r>
-              <w:rPr>
-                <w:rFonts w:ascii="Times New Roman" w:hAnsi="Times New Roman"/>
-                <w:b/>
-                <w:i w:val="0"/>
-                <w:sz w:val="22"/>
-              </w:rPr>
-              <w:t>MÔN: HOÁ HỌC – LỚP 12</w:t>
-              <w:br/>
-            </w:r>
-            <w:r>
-              <w:rPr>
-                <w:rFonts w:ascii="Times New Roman" w:hAnsi="Times New Roman"/>
-                <w:b w:val="0"/>
-                <w:i/>
-                <w:sz w:val="20"/>
-              </w:rPr>
-              <w:t>Thời gian làm bài: 45 phút</w:t>
-              <w:br/>
-              <w:t>(Không kể thời gian phát đề)</w:t>
-            </w:r>
-          </w:p>
-        </w:tc>
-      </w:tr>
-    </w:tbl>
+    <w:p>
+      <w:pPr>
+        <w:tabs>
+          <w:tab w:pos="2154" w:val="center"/>
+          <w:tab w:pos="7654" w:val="center"/>
+        </w:tabs>
+        <w:spacing w:before="0" w:after="20"/>
+      </w:pPr>
+      <w:r>
+        <w:tab/>
+      </w:r>
+      <w:r>
+        <w:rPr>
+          <w:rFonts w:ascii="Times New Roman" w:hAnsi="Times New Roman"/>
+          <w:b/>
+          <w:i w:val="0"/>
+          <w:sz w:val="21"/>
+        </w:rPr>
+        <w:t>SỞ GD &amp; ĐT THÀNH PHỐ HUẾ</w:t>
+      </w:r>
+      <w:r>
+        <w:tab/>
+      </w:r>
+      <w:r>
+        <w:rPr>
+          <w:rFonts w:ascii="Times New Roman" w:hAnsi="Times New Roman"/>
+          <w:b/>
+          <w:i w:val="0"/>
+          <w:sz w:val="22"/>
+        </w:rPr>
+        <w:t>ĐỀ KIỂM TRA GIỮA HỌC KÌ I – NĂM HỌC 2025-2026</w:t>
+      </w:r>
+    </w:p>
+    <w:p>
+      <w:pPr>
+        <w:tabs>
+          <w:tab w:pos="2154" w:val="center"/>
+          <w:tab w:pos="7654" w:val="center"/>
+        </w:tabs>
+        <w:spacing w:before="0" w:after="20"/>
+      </w:pPr>
+      <w:r>
+        <w:tab/>
+      </w:r>
+      <w:r>
+        <w:rPr>
+          <w:rFonts w:ascii="Times New Roman" w:hAnsi="Times New Roman"/>
+          <w:b/>
+          <w:i w:val="0"/>
+          <w:sz w:val="21"/>
+        </w:rPr>
+        <w:t>TRƯỜNG THPT HOÁ CHÂU</w:t>
+      </w:r>
+      <w:r>
+        <w:tab/>
+      </w:r>
+      <w:r>
+        <w:rPr>
+          <w:rFonts w:ascii="Times New Roman" w:hAnsi="Times New Roman"/>
+          <w:b/>
+          <w:i w:val="0"/>
+          <w:sz w:val="22"/>
+        </w:rPr>
+        <w:t>MÔN: HOÁ HỌC – LỚP 12</w:t>
+      </w:r>
+    </w:p>
+    <w:p>
+      <w:pPr>
+        <w:tabs>
+          <w:tab w:pos="2154" w:val="center"/>
+          <w:tab w:pos="7654" w:val="center"/>
+        </w:tabs>
+        <w:spacing w:before="0" w:after="20"/>
+      </w:pPr>
+      <w:r>
+        <w:tab/>
+      </w:r>
+      <w:r>
+        <w:rPr>
+          <w:rFonts w:ascii="Times New Roman" w:hAnsi="Times New Roman"/>
+          <w:b/>
+          <w:i w:val="0"/>
+          <w:sz w:val="21"/>
+        </w:rPr>
+        <w:t>ĐỀ CHÍNH THỨC</w:t>
+      </w:r>
+      <w:r>
+        <w:tab/>
+      </w:r>
+      <w:r>
+        <w:rPr>
+          <w:rFonts w:ascii="Times New Roman" w:hAnsi="Times New Roman"/>
+          <w:b w:val="0"/>
+          <w:i/>
+          <w:sz w:val="20"/>
+        </w:rPr>
+        <w:t>Thời gian làm bài: 45 phút (không kể thời gian phát đề)</w:t>
+      </w:r>
+    </w:p>
+    <w:p>
+      <w:pPr>
+        <w:tabs>
+          <w:tab w:pos="2154" w:val="center"/>
+          <w:tab w:pos="7654" w:val="center"/>
+        </w:tabs>
+        <w:spacing w:before="0" w:after="20"/>
+      </w:pPr>
+      <w:r>
+        <w:tab/>
+      </w:r>
+      <w:r>
+        <w:rPr>
+          <w:rFonts w:ascii="Times New Roman" w:hAnsi="Times New Roman"/>
+          <w:b w:val="0"/>
+          <w:i/>
+          <w:sz w:val="20"/>
+        </w:rPr>
+        <w:t>(Đề gồm có 03 trang)</w:t>
+      </w:r>
+      <w:r>
+        <w:tab/>
+      </w:r>
+      <w:r>
+        <w:rPr>
+          <w:rFonts w:ascii="Times New Roman" w:hAnsi="Times New Roman"/>
+          <w:b/>
+          <w:i w:val="0"/>
+          <w:sz w:val="22"/>
+        </w:rPr>
+        <w:t>MÃ ĐỀ: 485</w:t>
+      </w:r>
+    </w:p>
     <w:p>
       <w:pPr>
         <w:spacing w:before="80" w:after="40"/>
@@ -257,98 +291,61 @@
         <w:t xml:space="preserve"> Thuỷ phân 324 gam tinh bột với hiệu suất 75% khối lượng glucose thu được là</w:t>
       </w:r>
     </w:p>
-    <w:tbl>
-      <w:tblPr>
-        <w:tblW w:type="auto" w:w="0"/>
-        <w:jc w:val="center"/>
-        <w:tblLayout w:type="fixed"/>
-        <w:tblLook w:firstColumn="1" w:firstRow="1" w:lastColumn="0" w:lastRow="0" w:noHBand="0" w:noVBand="1" w:val="04A0"/>
-      </w:tblPr>
-      <w:tblGrid>
-        <w:gridCol w:w="2551"/>
-        <w:gridCol w:w="2551"/>
-        <w:gridCol w:w="2551"/>
-        <w:gridCol w:w="2551"/>
-      </w:tblGrid>
-      <w:tr>
-        <w:tc>
-          <w:tcPr>
-            <w:tcW w:type="dxa" w:w="2551"/>
-          </w:tcPr>
-          <w:p>
-            <w:pPr>
-              <w:spacing w:before="20" w:after="20"/>
-            </w:pPr>
-            <w:r>
-              <w:rPr>
-                <w:rFonts w:ascii="Times New Roman" w:hAnsi="Times New Roman"/>
-                <w:b w:val="0"/>
-                <w:i w:val="0"/>
-                <w:sz w:val="21"/>
-              </w:rPr>
-              <w:t>A. 360 gam.</w:t>
-            </w:r>
-          </w:p>
-        </w:tc>
-        <w:tc>
-          <w:tcPr>
-            <w:tcW w:type="dxa" w:w="2551"/>
-          </w:tcPr>
-          <w:p>
-            <w:pPr>
-              <w:spacing w:before="20" w:after="20"/>
-            </w:pPr>
-            <w:r>
-              <w:rPr>
-                <w:rFonts w:ascii="Times New Roman" w:hAnsi="Times New Roman"/>
-                <w:b w:val="0"/>
-                <w:i w:val="0"/>
-                <w:sz w:val="21"/>
-              </w:rPr>
-              <w:t>B. 270 gam.</w:t>
-            </w:r>
-          </w:p>
-        </w:tc>
-        <w:tc>
-          <w:tcPr>
-            <w:tcW w:type="dxa" w:w="2551"/>
-          </w:tcPr>
-          <w:p>
-            <w:pPr>
-              <w:spacing w:before="20" w:after="20"/>
-            </w:pPr>
-            <w:r>
-              <w:rPr>
-                <w:rFonts w:ascii="Times New Roman" w:hAnsi="Times New Roman"/>
-                <w:b w:val="0"/>
-                <w:i w:val="0"/>
-                <w:sz w:val="21"/>
-              </w:rPr>
-              <w:t>C. 300 gam.</w:t>
-            </w:r>
-          </w:p>
-        </w:tc>
-        <w:tc>
-          <w:tcPr>
-            <w:tcW w:type="dxa" w:w="2551"/>
-          </w:tcPr>
-          <w:p>
-            <w:pPr>
-              <w:spacing w:before="20" w:after="20"/>
-            </w:pPr>
-            <w:r>
-              <w:rPr>
-                <w:rFonts w:ascii="Times New Roman" w:hAnsi="Times New Roman"/>
-                <w:b w:val="0"/>
-                <w:i w:val="0"/>
-                <w:sz w:val="21"/>
-              </w:rPr>
-              <w:t>D. 250 gam.</w:t>
-            </w:r>
-          </w:p>
-        </w:tc>
-      </w:tr>
-    </w:tbl>
+    <w:p>
+      <w:pPr>
+        <w:tabs>
+          <w:tab w:pos="2551" w:val="left"/>
+          <w:tab w:pos="5102" w:val="left"/>
+          <w:tab w:pos="7654" w:val="left"/>
+        </w:tabs>
+        <w:spacing w:before="20" w:after="40"/>
+      </w:pPr>
+      <w:r>
+        <w:rPr>
+          <w:rFonts w:ascii="Times New Roman" w:hAnsi="Times New Roman"/>
+          <w:b w:val="0"/>
+          <w:i w:val="0"/>
+          <w:sz w:val="21"/>
+        </w:rPr>
+        <w:t>A. 360 gam.</w:t>
+      </w:r>
+      <w:r>
+        <w:tab/>
+      </w:r>
+      <w:r>
+        <w:rPr>
+          <w:rFonts w:ascii="Times New Roman" w:hAnsi="Times New Roman"/>
+          <w:b w:val="0"/>
+          <w:i w:val="0"/>
+          <w:sz w:val="21"/>
+        </w:rPr>
+        <w:t>B. 270 gam.</w:t>
+      </w:r>
+      <w:r>
+        <w:tab/>
+      </w:r>
+      <w:r>
+        <w:rPr>
+          <w:rFonts w:ascii="Times New Roman" w:hAnsi="Times New Roman"/>
+          <w:b w:val="0"/>
+          <w:i w:val="0"/>
+          <w:sz w:val="21"/>
+        </w:rPr>
+        <w:t>C. 300 gam.</w:t>
+      </w:r>
+      <w:r>
+        <w:tab/>
+      </w:r>
+      <w:r>
+        <w:rPr>
+          <w:rFonts w:ascii="Times New Roman" w:hAnsi="Times New Roman"/>
+          <w:b w:val="0"/>
+          <w:i w:val="0"/>
+          <w:sz w:val="21"/>
+        </w:rPr>
+        <w:t>D. 250 gam.</w:t>
+      </w:r>
+    </w:p>
     <w:p>
       <w:pPr>
         <w:spacing w:before="60" w:after="40"/>
@@ -372,98 +369,64 @@
         <w:t xml:space="preserve"> Phát biểu nào sau đây không đúng khi nhận xét về maltose?</w:t>
       </w:r>
     </w:p>
-    <w:tbl>
-      <w:tblPr>
-        <w:tblW w:type="auto" w:w="0"/>
-        <w:jc w:val="center"/>
-        <w:tblLayout w:type="fixed"/>
-        <w:tblLook w:firstColumn="1" w:firstRow="1" w:lastColumn="0" w:lastRow="0" w:noHBand="0" w:noVBand="1" w:val="04A0"/>
-      </w:tblPr>
-      <w:tblGrid>
-        <w:gridCol w:w="5103"/>
-        <w:gridCol w:w="5103"/>
-      </w:tblGrid>
-      <w:tr>
-        <w:tc>
-          <w:tcPr>
-            <w:tcW w:type="dxa" w:w="5102"/>
-          </w:tcPr>
-          <w:p>
-            <w:pPr>
-              <w:spacing w:before="20" w:after="20"/>
-            </w:pPr>
-            <w:r>
-              <w:rPr>
-                <w:rFonts w:ascii="Times New Roman" w:hAnsi="Times New Roman"/>
-                <w:b w:val="0"/>
-                <w:i w:val="0"/>
-                <w:sz w:val="21"/>
-              </w:rPr>
-              <w:t>A. Là một disaccharide.</w:t>
-            </w:r>
-          </w:p>
-        </w:tc>
-        <w:tc>
-          <w:tcPr>
-            <w:tcW w:type="dxa" w:w="5102"/>
-          </w:tcPr>
-          <w:p>
-            <w:pPr>
-              <w:spacing w:before="20" w:after="20"/>
-            </w:pPr>
-            <w:r>
-              <w:rPr>
-                <w:rFonts w:ascii="Times New Roman" w:hAnsi="Times New Roman"/>
-                <w:b w:val="0"/>
-                <w:i w:val="0"/>
-                <w:sz w:val="21"/>
-              </w:rPr>
-              <w:t>B. Phân tử có một nhóm -OH hemiacetal.</w:t>
-            </w:r>
-          </w:p>
-        </w:tc>
-      </w:tr>
-      <w:tr>
-        <w:tc>
-          <w:tcPr>
-            <w:tcW w:type="dxa" w:w="5102"/>
-          </w:tcPr>
-          <w:p>
-            <w:pPr>
-              <w:spacing w:before="20" w:after="20"/>
-            </w:pPr>
-            <w:r>
-              <w:rPr>
-                <w:rFonts w:ascii="Times New Roman" w:hAnsi="Times New Roman"/>
-                <w:b w:val="0"/>
-                <w:i w:val="0"/>
-                <w:sz w:val="21"/>
-              </w:rPr>
-              <w:t>C. Cho được phản ứng thuỷ phân.</w:t>
-            </w:r>
-          </w:p>
-        </w:tc>
-        <w:tc>
-          <w:tcPr>
-            <w:tcW w:type="dxa" w:w="5102"/>
-          </w:tcPr>
-          <w:p>
-            <w:pPr>
-              <w:spacing w:before="20" w:after="20"/>
-            </w:pPr>
-            <w:r>
-              <w:rPr>
-                <w:rFonts w:ascii="Times New Roman" w:hAnsi="Times New Roman"/>
-                <w:b w:val="0"/>
-                <w:i w:val="0"/>
-                <w:sz w:val="21"/>
-              </w:rPr>
-              <w:t>D. Không làm mất màu nước bromine.</w:t>
-            </w:r>
-          </w:p>
-        </w:tc>
-      </w:tr>
-    </w:tbl>
+    <w:p>
+      <w:pPr>
+        <w:tabs>
+          <w:tab w:pos="5102" w:val="left"/>
+        </w:tabs>
+        <w:spacing w:before="20" w:after="20"/>
+      </w:pPr>
+      <w:r>
+        <w:rPr>
+          <w:rFonts w:ascii="Times New Roman" w:hAnsi="Times New Roman"/>
+          <w:b w:val="0"/>
+          <w:i w:val="0"/>
+          <w:sz w:val="21"/>
+        </w:rPr>
+        <w:t>A. Là một disaccharide.</w:t>
+      </w:r>
+      <w:r>
+        <w:tab/>
+      </w:r>
+      <w:r>
+        <w:rPr>
+          <w:rFonts w:ascii="Times New Roman" w:hAnsi="Times New Roman"/>
+          <w:b w:val="0"/>
+          <w:i w:val="0"/>
+          <w:sz w:val="21"/>
+        </w:rPr>
+        <w:t>B. Phân tử có một nhóm -OH hemiacetal.</w:t>
+      </w:r>
+    </w:p>
+    <w:p>
+      <w:pPr>
+        <w:tabs>
+          <w:tab w:pos="5102" w:val="left"/>
+        </w:tabs>
+        <w:spacing w:before="20" w:after="40"/>
+      </w:pPr>
+      <w:r>
+        <w:rPr>
+          <w:rFonts w:ascii="Times New Roman" w:hAnsi="Times New Roman"/>
+          <w:b w:val="0"/>
+          <w:i w:val="0"/>
+          <w:sz w:val="21"/>
+        </w:rPr>
+        <w:t>C. Cho được phản ứng thuỷ phân.</w:t>
+      </w:r>
+      <w:r>
+        <w:tab/>
+      </w:r>
+      <w:r>
+        <w:rPr>
+          <w:rFonts w:ascii="Times New Roman" w:hAnsi="Times New Roman"/>
+          <w:b w:val="0"/>
+          <w:i w:val="0"/>
+          <w:sz w:val="21"/>
+        </w:rPr>
+        <w:t>D. Không làm mất màu nước bromine.</w:t>
+      </w:r>
+    </w:p>
     <w:p>
       <w:pPr>
         <w:spacing w:before="60" w:after="40"/>
@@ -487,459 +450,425 @@
         <w:t xml:space="preserve"> Khi xà phòng hoá tristearin thu được sản phẩm là</w:t>
       </w:r>
     </w:p>
-    <w:tbl>
-      <w:tblPr>
-        <w:tblW w:type="auto" w:w="0"/>
-        <w:jc w:val="center"/>
-        <w:tblLayout w:type="fixed"/>
-        <w:tblLook w:firstColumn="1" w:firstRow="1" w:lastColumn="0" w:lastRow="0" w:noHBand="0" w:noVBand="1" w:val="04A0"/>
-      </w:tblPr>
-      <w:tblGrid>
-        <w:gridCol w:w="5103"/>
-        <w:gridCol w:w="5103"/>
-      </w:tblGrid>
-      <w:tr>
-        <w:tc>
-          <w:tcPr>
-            <w:tcW w:type="dxa" w:w="5102"/>
-          </w:tcPr>
-          <w:p>
-            <w:pPr>
-              <w:spacing w:before="20" w:after="20"/>
-            </w:pPr>
-            <w:r>
-              <w:rPr>
-                <w:rFonts w:ascii="Times New Roman" w:hAnsi="Times New Roman"/>
-                <w:b w:val="0"/>
-                <w:i w:val="0"/>
-                <w:sz w:val="21"/>
-              </w:rPr>
-              <w:t>A. C</w:t>
-            </w:r>
-            <w:r>
-              <w:rPr>
-                <w:rFonts w:ascii="Times New Roman" w:hAnsi="Times New Roman"/>
-                <w:b w:val="0"/>
-                <w:i w:val="0"/>
-                <w:sz w:val="21"/>
-                <w:vertAlign w:val="subscript"/>
-              </w:rPr>
-              <w:t>15</w:t>
-            </w:r>
-            <w:r>
-              <w:rPr>
-                <w:rFonts w:ascii="Times New Roman" w:hAnsi="Times New Roman"/>
-                <w:b w:val="0"/>
-                <w:i w:val="0"/>
-                <w:sz w:val="21"/>
-              </w:rPr>
-              <w:t>H</w:t>
-            </w:r>
-            <w:r>
-              <w:rPr>
-                <w:rFonts w:ascii="Times New Roman" w:hAnsi="Times New Roman"/>
-                <w:b w:val="0"/>
-                <w:i w:val="0"/>
-                <w:sz w:val="21"/>
-                <w:vertAlign w:val="subscript"/>
-              </w:rPr>
-              <w:t>31</w:t>
-            </w:r>
-            <w:r>
-              <w:rPr>
-                <w:rFonts w:ascii="Times New Roman" w:hAnsi="Times New Roman"/>
-                <w:b w:val="0"/>
-                <w:i w:val="0"/>
-                <w:sz w:val="21"/>
-              </w:rPr>
-              <w:t>COONa và C</w:t>
-            </w:r>
-            <w:r>
-              <w:rPr>
-                <w:rFonts w:ascii="Times New Roman" w:hAnsi="Times New Roman"/>
-                <w:b w:val="0"/>
-                <w:i w:val="0"/>
-                <w:sz w:val="21"/>
-                <w:vertAlign w:val="subscript"/>
-              </w:rPr>
-              <w:t>2</w:t>
-            </w:r>
-            <w:r>
-              <w:rPr>
-                <w:rFonts w:ascii="Times New Roman" w:hAnsi="Times New Roman"/>
-                <w:b w:val="0"/>
-                <w:i w:val="0"/>
-                <w:sz w:val="21"/>
-              </w:rPr>
-              <w:t>H</w:t>
-            </w:r>
-            <w:r>
-              <w:rPr>
-                <w:rFonts w:ascii="Times New Roman" w:hAnsi="Times New Roman"/>
-                <w:b w:val="0"/>
-                <w:i w:val="0"/>
-                <w:sz w:val="21"/>
-                <w:vertAlign w:val="subscript"/>
-              </w:rPr>
-              <w:t>5</w:t>
-            </w:r>
-            <w:r>
-              <w:rPr>
-                <w:rFonts w:ascii="Times New Roman" w:hAnsi="Times New Roman"/>
-                <w:b w:val="0"/>
-                <w:i w:val="0"/>
-                <w:sz w:val="21"/>
-              </w:rPr>
-              <w:t>OH.</w:t>
-            </w:r>
-          </w:p>
-        </w:tc>
-        <w:tc>
-          <w:tcPr>
-            <w:tcW w:type="dxa" w:w="5102"/>
-          </w:tcPr>
-          <w:p>
-            <w:pPr>
-              <w:spacing w:before="20" w:after="20"/>
-            </w:pPr>
-            <w:r>
-              <w:rPr>
-                <w:rFonts w:ascii="Times New Roman" w:hAnsi="Times New Roman"/>
-                <w:b w:val="0"/>
-                <w:i w:val="0"/>
-                <w:sz w:val="21"/>
-              </w:rPr>
-              <w:t>B. C</w:t>
-            </w:r>
-            <w:r>
-              <w:rPr>
-                <w:rFonts w:ascii="Times New Roman" w:hAnsi="Times New Roman"/>
-                <w:b w:val="0"/>
-                <w:i w:val="0"/>
-                <w:sz w:val="21"/>
-                <w:vertAlign w:val="subscript"/>
-              </w:rPr>
-              <w:t>15</w:t>
-            </w:r>
-            <w:r>
-              <w:rPr>
-                <w:rFonts w:ascii="Times New Roman" w:hAnsi="Times New Roman"/>
-                <w:b w:val="0"/>
-                <w:i w:val="0"/>
-                <w:sz w:val="21"/>
-              </w:rPr>
-              <w:t>H</w:t>
-            </w:r>
-            <w:r>
-              <w:rPr>
-                <w:rFonts w:ascii="Times New Roman" w:hAnsi="Times New Roman"/>
-                <w:b w:val="0"/>
-                <w:i w:val="0"/>
-                <w:sz w:val="21"/>
-                <w:vertAlign w:val="subscript"/>
-              </w:rPr>
-              <w:t>31</w:t>
-            </w:r>
-            <w:r>
-              <w:rPr>
-                <w:rFonts w:ascii="Times New Roman" w:hAnsi="Times New Roman"/>
-                <w:b w:val="0"/>
-                <w:i w:val="0"/>
-                <w:sz w:val="21"/>
-              </w:rPr>
-              <w:t>COOH và C</w:t>
-            </w:r>
-            <w:r>
-              <w:rPr>
-                <w:rFonts w:ascii="Times New Roman" w:hAnsi="Times New Roman"/>
-                <w:b w:val="0"/>
-                <w:i w:val="0"/>
-                <w:sz w:val="21"/>
-                <w:vertAlign w:val="subscript"/>
-              </w:rPr>
-              <w:t>3</w:t>
-            </w:r>
-            <w:r>
-              <w:rPr>
-                <w:rFonts w:ascii="Times New Roman" w:hAnsi="Times New Roman"/>
-                <w:b w:val="0"/>
-                <w:i w:val="0"/>
-                <w:sz w:val="21"/>
-              </w:rPr>
-              <w:t>H</w:t>
-            </w:r>
-            <w:r>
-              <w:rPr>
-                <w:rFonts w:ascii="Times New Roman" w:hAnsi="Times New Roman"/>
-                <w:b w:val="0"/>
-                <w:i w:val="0"/>
-                <w:sz w:val="21"/>
-                <w:vertAlign w:val="subscript"/>
-              </w:rPr>
-              <w:t>5</w:t>
-            </w:r>
-            <w:r>
-              <w:rPr>
-                <w:rFonts w:ascii="Times New Roman" w:hAnsi="Times New Roman"/>
-                <w:b w:val="0"/>
-                <w:i w:val="0"/>
-                <w:sz w:val="21"/>
-              </w:rPr>
-              <w:t>(OH)</w:t>
-            </w:r>
-            <w:r>
-              <w:rPr>
-                <w:rFonts w:ascii="Times New Roman" w:hAnsi="Times New Roman"/>
-                <w:b w:val="0"/>
-                <w:i w:val="0"/>
-                <w:sz w:val="21"/>
-                <w:vertAlign w:val="subscript"/>
-              </w:rPr>
-              <w:t>3</w:t>
-            </w:r>
-            <w:r>
-              <w:rPr>
-                <w:rFonts w:ascii="Times New Roman" w:hAnsi="Times New Roman"/>
-                <w:b w:val="0"/>
-                <w:i w:val="0"/>
-                <w:sz w:val="21"/>
-              </w:rPr>
-              <w:t>.</w:t>
-            </w:r>
-          </w:p>
-        </w:tc>
-      </w:tr>
-      <w:tr>
-        <w:tc>
-          <w:tcPr>
-            <w:tcW w:type="dxa" w:w="5102"/>
-          </w:tcPr>
-          <w:p>
-            <w:pPr>
-              <w:spacing w:before="20" w:after="20"/>
-            </w:pPr>
-            <w:r>
-              <w:rPr>
-                <w:rFonts w:ascii="Times New Roman" w:hAnsi="Times New Roman"/>
-                <w:b w:val="0"/>
-                <w:i w:val="0"/>
-                <w:sz w:val="21"/>
-              </w:rPr>
-              <w:t>C. C</w:t>
-            </w:r>
-            <w:r>
-              <w:rPr>
-                <w:rFonts w:ascii="Times New Roman" w:hAnsi="Times New Roman"/>
-                <w:b w:val="0"/>
-                <w:i w:val="0"/>
-                <w:sz w:val="21"/>
-                <w:vertAlign w:val="subscript"/>
-              </w:rPr>
-              <w:t>17</w:t>
-            </w:r>
-            <w:r>
-              <w:rPr>
-                <w:rFonts w:ascii="Times New Roman" w:hAnsi="Times New Roman"/>
-                <w:b w:val="0"/>
-                <w:i w:val="0"/>
-                <w:sz w:val="21"/>
-              </w:rPr>
-              <w:t>H</w:t>
-            </w:r>
-            <w:r>
-              <w:rPr>
-                <w:rFonts w:ascii="Times New Roman" w:hAnsi="Times New Roman"/>
-                <w:b w:val="0"/>
-                <w:i w:val="0"/>
-                <w:sz w:val="21"/>
-                <w:vertAlign w:val="subscript"/>
-              </w:rPr>
-              <w:t>35</w:t>
-            </w:r>
-            <w:r>
-              <w:rPr>
-                <w:rFonts w:ascii="Times New Roman" w:hAnsi="Times New Roman"/>
-                <w:b w:val="0"/>
-                <w:i w:val="0"/>
-                <w:sz w:val="21"/>
-              </w:rPr>
-              <w:t>COONa và C</w:t>
-            </w:r>
-            <w:r>
-              <w:rPr>
-                <w:rFonts w:ascii="Times New Roman" w:hAnsi="Times New Roman"/>
-                <w:b w:val="0"/>
-                <w:i w:val="0"/>
-                <w:sz w:val="21"/>
-                <w:vertAlign w:val="subscript"/>
-              </w:rPr>
-              <w:t>3</w:t>
-            </w:r>
-            <w:r>
-              <w:rPr>
-                <w:rFonts w:ascii="Times New Roman" w:hAnsi="Times New Roman"/>
-                <w:b w:val="0"/>
-                <w:i w:val="0"/>
-                <w:sz w:val="21"/>
-              </w:rPr>
-              <w:t>H</w:t>
-            </w:r>
-            <w:r>
-              <w:rPr>
-                <w:rFonts w:ascii="Times New Roman" w:hAnsi="Times New Roman"/>
-                <w:b w:val="0"/>
-                <w:i w:val="0"/>
-                <w:sz w:val="21"/>
-                <w:vertAlign w:val="subscript"/>
-              </w:rPr>
-              <w:t>5</w:t>
-            </w:r>
-            <w:r>
-              <w:rPr>
-                <w:rFonts w:ascii="Times New Roman" w:hAnsi="Times New Roman"/>
-                <w:b w:val="0"/>
-                <w:i w:val="0"/>
-                <w:sz w:val="21"/>
-              </w:rPr>
-              <w:t>(OH)</w:t>
-            </w:r>
-            <w:r>
-              <w:rPr>
-                <w:rFonts w:ascii="Times New Roman" w:hAnsi="Times New Roman"/>
-                <w:b w:val="0"/>
-                <w:i w:val="0"/>
-                <w:sz w:val="21"/>
-                <w:vertAlign w:val="subscript"/>
-              </w:rPr>
-              <w:t>3</w:t>
-            </w:r>
-            <w:r>
-              <w:rPr>
-                <w:rFonts w:ascii="Times New Roman" w:hAnsi="Times New Roman"/>
-                <w:b w:val="0"/>
-                <w:i w:val="0"/>
-                <w:sz w:val="21"/>
-              </w:rPr>
-              <w:t>.</w:t>
-            </w:r>
-          </w:p>
-        </w:tc>
-        <w:tc>
-          <w:tcPr>
-            <w:tcW w:type="dxa" w:w="5102"/>
-          </w:tcPr>
-          <w:p>
-            <w:pPr>
-              <w:spacing w:before="20" w:after="20"/>
-            </w:pPr>
-            <w:r>
-              <w:rPr>
-                <w:rFonts w:ascii="Times New Roman" w:hAnsi="Times New Roman"/>
-                <w:b w:val="0"/>
-                <w:i w:val="0"/>
-                <w:sz w:val="21"/>
-              </w:rPr>
-              <w:t>D. C</w:t>
-            </w:r>
-            <w:r>
-              <w:rPr>
-                <w:rFonts w:ascii="Times New Roman" w:hAnsi="Times New Roman"/>
-                <w:b w:val="0"/>
-                <w:i w:val="0"/>
-                <w:sz w:val="21"/>
-                <w:vertAlign w:val="subscript"/>
-              </w:rPr>
-              <w:t>17</w:t>
-            </w:r>
-            <w:r>
-              <w:rPr>
-                <w:rFonts w:ascii="Times New Roman" w:hAnsi="Times New Roman"/>
-                <w:b w:val="0"/>
-                <w:i w:val="0"/>
-                <w:sz w:val="21"/>
-              </w:rPr>
-              <w:t>H</w:t>
-            </w:r>
-            <w:r>
-              <w:rPr>
-                <w:rFonts w:ascii="Times New Roman" w:hAnsi="Times New Roman"/>
-                <w:b w:val="0"/>
-                <w:i w:val="0"/>
-                <w:sz w:val="21"/>
-                <w:vertAlign w:val="subscript"/>
-              </w:rPr>
-              <w:t>35</w:t>
-            </w:r>
-            <w:r>
-              <w:rPr>
-                <w:rFonts w:ascii="Times New Roman" w:hAnsi="Times New Roman"/>
-                <w:b w:val="0"/>
-                <w:i w:val="0"/>
-                <w:sz w:val="21"/>
-              </w:rPr>
-              <w:t>COOH và C</w:t>
-            </w:r>
-            <w:r>
-              <w:rPr>
-                <w:rFonts w:ascii="Times New Roman" w:hAnsi="Times New Roman"/>
-                <w:b w:val="0"/>
-                <w:i w:val="0"/>
-                <w:sz w:val="21"/>
-                <w:vertAlign w:val="subscript"/>
-              </w:rPr>
-              <w:t>3</w:t>
-            </w:r>
-            <w:r>
-              <w:rPr>
-                <w:rFonts w:ascii="Times New Roman" w:hAnsi="Times New Roman"/>
-                <w:b w:val="0"/>
-                <w:i w:val="0"/>
-                <w:sz w:val="21"/>
-              </w:rPr>
-              <w:t>H</w:t>
-            </w:r>
-            <w:r>
-              <w:rPr>
-                <w:rFonts w:ascii="Times New Roman" w:hAnsi="Times New Roman"/>
-                <w:b w:val="0"/>
-                <w:i w:val="0"/>
-                <w:sz w:val="21"/>
-                <w:vertAlign w:val="subscript"/>
-              </w:rPr>
-              <w:t>5</w:t>
-            </w:r>
-            <w:r>
-              <w:rPr>
-                <w:rFonts w:ascii="Times New Roman" w:hAnsi="Times New Roman"/>
-                <w:b w:val="0"/>
-                <w:i w:val="0"/>
-                <w:sz w:val="21"/>
-              </w:rPr>
-              <w:t>(OH)</w:t>
-            </w:r>
-            <w:r>
-              <w:rPr>
-                <w:rFonts w:ascii="Times New Roman" w:hAnsi="Times New Roman"/>
-                <w:b w:val="0"/>
-                <w:i w:val="0"/>
-                <w:sz w:val="21"/>
-                <w:vertAlign w:val="subscript"/>
-              </w:rPr>
-              <w:t>3</w:t>
-            </w:r>
-            <w:r>
-              <w:rPr>
-                <w:rFonts w:ascii="Times New Roman" w:hAnsi="Times New Roman"/>
-                <w:b w:val="0"/>
-                <w:i w:val="0"/>
-                <w:sz w:val="21"/>
-              </w:rPr>
-              <w:t>.</w:t>
-            </w:r>
-          </w:p>
-        </w:tc>
-      </w:tr>
-    </w:tbl>
+    <w:p>
+      <w:pPr>
+        <w:tabs>
+          <w:tab w:pos="5102" w:val="left"/>
+        </w:tabs>
+        <w:spacing w:before="20" w:after="20"/>
+      </w:pPr>
+      <w:r>
+        <w:rPr>
+          <w:rFonts w:ascii="Times New Roman" w:hAnsi="Times New Roman"/>
+          <w:b w:val="0"/>
+          <w:i w:val="0"/>
+          <w:sz w:val="21"/>
+        </w:rPr>
+        <w:t>A. C</w:t>
+      </w:r>
+      <w:r>
+        <w:rPr>
+          <w:rFonts w:ascii="Times New Roman" w:hAnsi="Times New Roman"/>
+          <w:b w:val="0"/>
+          <w:i w:val="0"/>
+          <w:sz w:val="21"/>
+          <w:vertAlign w:val="subscript"/>
+        </w:rPr>
+        <w:t>15</w:t>
+      </w:r>
+      <w:r>
+        <w:rPr>
+          <w:rFonts w:ascii="Times New Roman" w:hAnsi="Times New Roman"/>
+          <w:b w:val="0"/>
+          <w:i w:val="0"/>
+          <w:sz w:val="21"/>
+        </w:rPr>
+        <w:t>H</w:t>
+      </w:r>
+      <w:r>
+        <w:rPr>
+          <w:rFonts w:ascii="Times New Roman" w:hAnsi="Times New Roman"/>
+          <w:b w:val="0"/>
+          <w:i w:val="0"/>
+          <w:sz w:val="21"/>
+          <w:vertAlign w:val="subscript"/>
+        </w:rPr>
+        <w:t>31</w:t>
+      </w:r>
+      <w:r>
+        <w:rPr>
+          <w:rFonts w:ascii="Times New Roman" w:hAnsi="Times New Roman"/>
+          <w:b w:val="0"/>
+          <w:i w:val="0"/>
+          <w:sz w:val="21"/>
+        </w:rPr>
+        <w:t>COONa và C</w:t>
+      </w:r>
+      <w:r>
+        <w:rPr>
+          <w:rFonts w:ascii="Times New Roman" w:hAnsi="Times New Roman"/>
+          <w:b w:val="0"/>
+          <w:i w:val="0"/>
+          <w:sz w:val="21"/>
+          <w:vertAlign w:val="subscript"/>
+        </w:rPr>
+        <w:t>2</w:t>
+      </w:r>
+      <w:r>
+        <w:rPr>
+          <w:rFonts w:ascii="Times New Roman" w:hAnsi="Times New Roman"/>
+          <w:b w:val="0"/>
+          <w:i w:val="0"/>
+          <w:sz w:val="21"/>
+        </w:rPr>
+        <w:t>H</w:t>
+      </w:r>
+      <w:r>
+        <w:rPr>
+          <w:rFonts w:ascii="Times New Roman" w:hAnsi="Times New Roman"/>
+          <w:b w:val="0"/>
+          <w:i w:val="0"/>
+          <w:sz w:val="21"/>
+          <w:vertAlign w:val="subscript"/>
+        </w:rPr>
+        <w:t>5</w:t>
+      </w:r>
+      <w:r>
+        <w:rPr>
+          <w:rFonts w:ascii="Times New Roman" w:hAnsi="Times New Roman"/>
+          <w:b w:val="0"/>
+          <w:i w:val="0"/>
+          <w:sz w:val="21"/>
+        </w:rPr>
+        <w:t>OH.</w:t>
+      </w:r>
+      <w:r>
+        <w:tab/>
+      </w:r>
+      <w:r>
+        <w:rPr>
+          <w:rFonts w:ascii="Times New Roman" w:hAnsi="Times New Roman"/>
+          <w:b w:val="0"/>
+          <w:i w:val="0"/>
+          <w:sz w:val="21"/>
+        </w:rPr>
+        <w:t>B. C</w:t>
+      </w:r>
+      <w:r>
+        <w:rPr>
+          <w:rFonts w:ascii="Times New Roman" w:hAnsi="Times New Roman"/>
+          <w:b w:val="0"/>
+          <w:i w:val="0"/>
+          <w:sz w:val="21"/>
+          <w:vertAlign w:val="subscript"/>
+        </w:rPr>
+        <w:t>15</w:t>
+      </w:r>
+      <w:r>
+        <w:rPr>
+          <w:rFonts w:ascii="Times New Roman" w:hAnsi="Times New Roman"/>
+          <w:b w:val="0"/>
+          <w:i w:val="0"/>
+          <w:sz w:val="21"/>
+        </w:rPr>
+        <w:t>H</w:t>
+      </w:r>
+      <w:r>
+        <w:rPr>
+          <w:rFonts w:ascii="Times New Roman" w:hAnsi="Times New Roman"/>
+          <w:b w:val="0"/>
+          <w:i w:val="0"/>
+          <w:sz w:val="21"/>
+          <w:vertAlign w:val="subscript"/>
+        </w:rPr>
+        <w:t>31</w:t>
+      </w:r>
+      <w:r>
+        <w:rPr>
+          <w:rFonts w:ascii="Times New Roman" w:hAnsi="Times New Roman"/>
+          <w:b w:val="0"/>
+          <w:i w:val="0"/>
+          <w:sz w:val="21"/>
+        </w:rPr>
+        <w:t>COOH và C</w:t>
+      </w:r>
+      <w:r>
+        <w:rPr>
+          <w:rFonts w:ascii="Times New Roman" w:hAnsi="Times New Roman"/>
+          <w:b w:val="0"/>
+          <w:i w:val="0"/>
+          <w:sz w:val="21"/>
+          <w:vertAlign w:val="subscript"/>
+        </w:rPr>
+        <w:t>3</w:t>
+      </w:r>
+      <w:r>
+        <w:rPr>
+          <w:rFonts w:ascii="Times New Roman" w:hAnsi="Times New Roman"/>
+          <w:b w:val="0"/>
+          <w:i w:val="0"/>
+          <w:sz w:val="21"/>
+        </w:rPr>
+        <w:t>H</w:t>
+      </w:r>
+      <w:r>
+        <w:rPr>
+          <w:rFonts w:ascii="Times New Roman" w:hAnsi="Times New Roman"/>
+          <w:b w:val="0"/>
+          <w:i w:val="0"/>
+          <w:sz w:val="21"/>
+          <w:vertAlign w:val="subscript"/>
+        </w:rPr>
+        <w:t>5</w:t>
+      </w:r>
+      <w:r>
+        <w:rPr>
+          <w:rFonts w:ascii="Times New Roman" w:hAnsi="Times New Roman"/>
+          <w:b w:val="0"/>
+          <w:i w:val="0"/>
+          <w:sz w:val="21"/>
+        </w:rPr>
+        <w:t>(OH)</w:t>
+      </w:r>
+      <w:r>
+        <w:rPr>
+          <w:rFonts w:ascii="Times New Roman" w:hAnsi="Times New Roman"/>
+          <w:b w:val="0"/>
+          <w:i w:val="0"/>
+          <w:sz w:val="21"/>
+          <w:vertAlign w:val="subscript"/>
+        </w:rPr>
+        <w:t>3</w:t>
+      </w:r>
+      <w:r>
+        <w:rPr>
+          <w:rFonts w:ascii="Times New Roman" w:hAnsi="Times New Roman"/>
+          <w:b w:val="0"/>
+          <w:i w:val="0"/>
+          <w:sz w:val="21"/>
+        </w:rPr>
+        <w:t>.</w:t>
+      </w:r>
+    </w:p>
+    <w:p>
+      <w:pPr>
+        <w:tabs>
+          <w:tab w:pos="5102" w:val="left"/>
+        </w:tabs>
+        <w:spacing w:before="20" w:after="40"/>
+      </w:pPr>
+      <w:r>
+        <w:rPr>
+          <w:rFonts w:ascii="Times New Roman" w:hAnsi="Times New Roman"/>
+          <w:b w:val="0"/>
+          <w:i w:val="0"/>
+          <w:sz w:val="21"/>
+        </w:rPr>
+        <w:t>C. C</w:t>
+      </w:r>
+      <w:r>
+        <w:rPr>
+          <w:rFonts w:ascii="Times New Roman" w:hAnsi="Times New Roman"/>
+          <w:b w:val="0"/>
+          <w:i w:val="0"/>
+          <w:sz w:val="21"/>
+          <w:vertAlign w:val="subscript"/>
+        </w:rPr>
+        <w:t>17</w:t>
+      </w:r>
+      <w:r>
+        <w:rPr>
+          <w:rFonts w:ascii="Times New Roman" w:hAnsi="Times New Roman"/>
+          <w:b w:val="0"/>
+          <w:i w:val="0"/>
+          <w:sz w:val="21"/>
+        </w:rPr>
+        <w:t>H</w:t>
+      </w:r>
+      <w:r>
+        <w:rPr>
+          <w:rFonts w:ascii="Times New Roman" w:hAnsi="Times New Roman"/>
+          <w:b w:val="0"/>
+          <w:i w:val="0"/>
+          <w:sz w:val="21"/>
+          <w:vertAlign w:val="subscript"/>
+        </w:rPr>
+        <w:t>35</w:t>
+      </w:r>
+      <w:r>
+        <w:rPr>
+          <w:rFonts w:ascii="Times New Roman" w:hAnsi="Times New Roman"/>
+          <w:b w:val="0"/>
+          <w:i w:val="0"/>
+          <w:sz w:val="21"/>
+        </w:rPr>
+        <w:t>COONa và C</w:t>
+      </w:r>
+      <w:r>
+        <w:rPr>
+          <w:rFonts w:ascii="Times New Roman" w:hAnsi="Times New Roman"/>
+          <w:b w:val="0"/>
+          <w:i w:val="0"/>
+          <w:sz w:val="21"/>
+          <w:vertAlign w:val="subscript"/>
+        </w:rPr>
+        <w:t>3</w:t>
+      </w:r>
+      <w:r>
+        <w:rPr>
+          <w:rFonts w:ascii="Times New Roman" w:hAnsi="Times New Roman"/>
+          <w:b w:val="0"/>
+          <w:i w:val="0"/>
+          <w:sz w:val="21"/>
+        </w:rPr>
+        <w:t>H</w:t>
+      </w:r>
+      <w:r>
+        <w:rPr>
+          <w:rFonts w:ascii="Times New Roman" w:hAnsi="Times New Roman"/>
+          <w:b w:val="0"/>
+          <w:i w:val="0"/>
+          <w:sz w:val="21"/>
+          <w:vertAlign w:val="subscript"/>
+        </w:rPr>
+        <w:t>5</w:t>
+      </w:r>
+      <w:r>
+        <w:rPr>
+          <w:rFonts w:ascii="Times New Roman" w:hAnsi="Times New Roman"/>
+          <w:b w:val="0"/>
+          <w:i w:val="0"/>
+          <w:sz w:val="21"/>
+        </w:rPr>
+        <w:t>(OH)</w:t>
+      </w:r>
+      <w:r>
+        <w:rPr>
+          <w:rFonts w:ascii="Times New Roman" w:hAnsi="Times New Roman"/>
+          <w:b w:val="0"/>
+          <w:i w:val="0"/>
+          <w:sz w:val="21"/>
+          <w:vertAlign w:val="subscript"/>
+        </w:rPr>
+        <w:t>3</w:t>
+      </w:r>
+      <w:r>
+        <w:rPr>
+          <w:rFonts w:ascii="Times New Roman" w:hAnsi="Times New Roman"/>
+          <w:b w:val="0"/>
+          <w:i w:val="0"/>
+          <w:sz w:val="21"/>
+        </w:rPr>
+        <w:t>.</w:t>
+      </w:r>
+      <w:r>
+        <w:tab/>
+      </w:r>
+      <w:r>
+        <w:rPr>
+          <w:rFonts w:ascii="Times New Roman" w:hAnsi="Times New Roman"/>
+          <w:b w:val="0"/>
+          <w:i w:val="0"/>
+          <w:sz w:val="21"/>
+        </w:rPr>
+        <w:t>D. C</w:t>
+      </w:r>
+      <w:r>
+        <w:rPr>
+          <w:rFonts w:ascii="Times New Roman" w:hAnsi="Times New Roman"/>
+          <w:b w:val="0"/>
+          <w:i w:val="0"/>
+          <w:sz w:val="21"/>
+          <w:vertAlign w:val="subscript"/>
+        </w:rPr>
+        <w:t>17</w:t>
+      </w:r>
+      <w:r>
+        <w:rPr>
+          <w:rFonts w:ascii="Times New Roman" w:hAnsi="Times New Roman"/>
+          <w:b w:val="0"/>
+          <w:i w:val="0"/>
+          <w:sz w:val="21"/>
+        </w:rPr>
+        <w:t>H</w:t>
+      </w:r>
+      <w:r>
+        <w:rPr>
+          <w:rFonts w:ascii="Times New Roman" w:hAnsi="Times New Roman"/>
+          <w:b w:val="0"/>
+          <w:i w:val="0"/>
+          <w:sz w:val="21"/>
+          <w:vertAlign w:val="subscript"/>
+        </w:rPr>
+        <w:t>35</w:t>
+      </w:r>
+      <w:r>
+        <w:rPr>
+          <w:rFonts w:ascii="Times New Roman" w:hAnsi="Times New Roman"/>
+          <w:b w:val="0"/>
+          <w:i w:val="0"/>
+          <w:sz w:val="21"/>
+        </w:rPr>
+        <w:t>COOH và C</w:t>
+      </w:r>
+      <w:r>
+        <w:rPr>
+          <w:rFonts w:ascii="Times New Roman" w:hAnsi="Times New Roman"/>
+          <w:b w:val="0"/>
+          <w:i w:val="0"/>
+          <w:sz w:val="21"/>
+          <w:vertAlign w:val="subscript"/>
+        </w:rPr>
+        <w:t>3</w:t>
+      </w:r>
+      <w:r>
+        <w:rPr>
+          <w:rFonts w:ascii="Times New Roman" w:hAnsi="Times New Roman"/>
+          <w:b w:val="0"/>
+          <w:i w:val="0"/>
+          <w:sz w:val="21"/>
+        </w:rPr>
+        <w:t>H</w:t>
+      </w:r>
+      <w:r>
+        <w:rPr>
+          <w:rFonts w:ascii="Times New Roman" w:hAnsi="Times New Roman"/>
+          <w:b w:val="0"/>
+          <w:i w:val="0"/>
+          <w:sz w:val="21"/>
+          <w:vertAlign w:val="subscript"/>
+        </w:rPr>
+        <w:t>5</w:t>
+      </w:r>
+      <w:r>
+        <w:rPr>
+          <w:rFonts w:ascii="Times New Roman" w:hAnsi="Times New Roman"/>
+          <w:b w:val="0"/>
+          <w:i w:val="0"/>
+          <w:sz w:val="21"/>
+        </w:rPr>
+        <w:t>(OH)</w:t>
+      </w:r>
+      <w:r>
+        <w:rPr>
+          <w:rFonts w:ascii="Times New Roman" w:hAnsi="Times New Roman"/>
+          <w:b w:val="0"/>
+          <w:i w:val="0"/>
+          <w:sz w:val="21"/>
+          <w:vertAlign w:val="subscript"/>
+        </w:rPr>
+        <w:t>3</w:t>
+      </w:r>
+      <w:r>
+        <w:rPr>
+          <w:rFonts w:ascii="Times New Roman" w:hAnsi="Times New Roman"/>
+          <w:b w:val="0"/>
+          <w:i w:val="0"/>
+          <w:sz w:val="21"/>
+        </w:rPr>
+        <w:t>.</w:t>
+      </w:r>
+    </w:p>
     <w:p>
       <w:pPr>
         <w:spacing w:before="60" w:after="40"/>
@@ -1003,98 +932,61 @@
         </w:drawing>
       </w:r>
     </w:p>
-    <w:tbl>
-      <w:tblPr>
-        <w:tblW w:type="auto" w:w="0"/>
-        <w:jc w:val="center"/>
-        <w:tblLayout w:type="fixed"/>
-        <w:tblLook w:firstColumn="1" w:firstRow="1" w:lastColumn="0" w:lastRow="0" w:noHBand="0" w:noVBand="1" w:val="04A0"/>
-      </w:tblPr>
-      <w:tblGrid>
-        <w:gridCol w:w="2551"/>
-        <w:gridCol w:w="2551"/>
-        <w:gridCol w:w="2551"/>
-        <w:gridCol w:w="2551"/>
-      </w:tblGrid>
-      <w:tr>
-        <w:tc>
-          <w:tcPr>
-            <w:tcW w:type="dxa" w:w="2551"/>
-          </w:tcPr>
-          <w:p>
-            <w:pPr>
-              <w:spacing w:before="20" w:after="20"/>
-            </w:pPr>
-            <w:r>
-              <w:rPr>
-                <w:rFonts w:ascii="Times New Roman" w:hAnsi="Times New Roman"/>
-                <w:b w:val="0"/>
-                <w:i w:val="0"/>
-                <w:sz w:val="21"/>
-              </w:rPr>
-              <w:t>A. Cấu trúc A.</w:t>
-            </w:r>
-          </w:p>
-        </w:tc>
-        <w:tc>
-          <w:tcPr>
-            <w:tcW w:type="dxa" w:w="2551"/>
-          </w:tcPr>
-          <w:p>
-            <w:pPr>
-              <w:spacing w:before="20" w:after="20"/>
-            </w:pPr>
-            <w:r>
-              <w:rPr>
-                <w:rFonts w:ascii="Times New Roman" w:hAnsi="Times New Roman"/>
-                <w:b w:val="0"/>
-                <w:i w:val="0"/>
-                <w:sz w:val="21"/>
-              </w:rPr>
-              <w:t>B. Cấu trúc B.</w:t>
-            </w:r>
-          </w:p>
-        </w:tc>
-        <w:tc>
-          <w:tcPr>
-            <w:tcW w:type="dxa" w:w="2551"/>
-          </w:tcPr>
-          <w:p>
-            <w:pPr>
-              <w:spacing w:before="20" w:after="20"/>
-            </w:pPr>
-            <w:r>
-              <w:rPr>
-                <w:rFonts w:ascii="Times New Roman" w:hAnsi="Times New Roman"/>
-                <w:b w:val="0"/>
-                <w:i w:val="0"/>
-                <w:sz w:val="21"/>
-              </w:rPr>
-              <w:t>C. Cấu trúc C.</w:t>
-            </w:r>
-          </w:p>
-        </w:tc>
-        <w:tc>
-          <w:tcPr>
-            <w:tcW w:type="dxa" w:w="2551"/>
-          </w:tcPr>
-          <w:p>
-            <w:pPr>
-              <w:spacing w:before="20" w:after="20"/>
-            </w:pPr>
-            <w:r>
-              <w:rPr>
-                <w:rFonts w:ascii="Times New Roman" w:hAnsi="Times New Roman"/>
-                <w:b w:val="0"/>
-                <w:i w:val="0"/>
-                <w:sz w:val="21"/>
-              </w:rPr>
-              <w:t>D. Cấu trúc D.</w:t>
-            </w:r>
-          </w:p>
-        </w:tc>
-      </w:tr>
-    </w:tbl>
+    <w:p>
+      <w:pPr>
+        <w:tabs>
+          <w:tab w:pos="2551" w:val="left"/>
+          <w:tab w:pos="5102" w:val="left"/>
+          <w:tab w:pos="7654" w:val="left"/>
+        </w:tabs>
+        <w:spacing w:before="20" w:after="40"/>
+      </w:pPr>
+      <w:r>
+        <w:rPr>
+          <w:rFonts w:ascii="Times New Roman" w:hAnsi="Times New Roman"/>
+          <w:b w:val="0"/>
+          <w:i w:val="0"/>
+          <w:sz w:val="21"/>
+        </w:rPr>
+        <w:t>A. Cấu trúc A.</w:t>
+      </w:r>
+      <w:r>
+        <w:tab/>
+      </w:r>
+      <w:r>
+        <w:rPr>
+          <w:rFonts w:ascii="Times New Roman" w:hAnsi="Times New Roman"/>
+          <w:b w:val="0"/>
+          <w:i w:val="0"/>
+          <w:sz w:val="21"/>
+        </w:rPr>
+        <w:t>B. Cấu trúc B.</w:t>
+      </w:r>
+      <w:r>
+        <w:tab/>
+      </w:r>
+      <w:r>
+        <w:rPr>
+          <w:rFonts w:ascii="Times New Roman" w:hAnsi="Times New Roman"/>
+          <w:b w:val="0"/>
+          <w:i w:val="0"/>
+          <w:sz w:val="21"/>
+        </w:rPr>
+        <w:t>C. Cấu trúc C.</w:t>
+      </w:r>
+      <w:r>
+        <w:tab/>
+      </w:r>
+      <w:r>
+        <w:rPr>
+          <w:rFonts w:ascii="Times New Roman" w:hAnsi="Times New Roman"/>
+          <w:b w:val="0"/>
+          <w:i w:val="0"/>
+          <w:sz w:val="21"/>
+        </w:rPr>
+        <w:t>D. Cấu trúc D.</w:t>
+      </w:r>
+    </w:p>
     <w:p>
       <w:pPr>
         <w:spacing w:before="60" w:after="40"/>
@@ -1156,98 +1048,61 @@
         <w:t xml:space="preserve"> đặc cùng một ít đá bọt trong 20 phút. Khối lượng ester thu được sau khi tách khỏi hỗn hợp và làm sạch là 8 gam. Hiệu suất phản ứng ester hoá đạt</w:t>
       </w:r>
     </w:p>
-    <w:tbl>
-      <w:tblPr>
-        <w:tblW w:type="auto" w:w="0"/>
-        <w:jc w:val="center"/>
-        <w:tblLayout w:type="fixed"/>
-        <w:tblLook w:firstColumn="1" w:firstRow="1" w:lastColumn="0" w:lastRow="0" w:noHBand="0" w:noVBand="1" w:val="04A0"/>
-      </w:tblPr>
-      <w:tblGrid>
-        <w:gridCol w:w="2551"/>
-        <w:gridCol w:w="2551"/>
-        <w:gridCol w:w="2551"/>
-        <w:gridCol w:w="2551"/>
-      </w:tblGrid>
-      <w:tr>
-        <w:tc>
-          <w:tcPr>
-            <w:tcW w:type="dxa" w:w="2551"/>
-          </w:tcPr>
-          <w:p>
-            <w:pPr>
-              <w:spacing w:before="20" w:after="20"/>
-            </w:pPr>
-            <w:r>
-              <w:rPr>
-                <w:rFonts w:ascii="Times New Roman" w:hAnsi="Times New Roman"/>
-                <w:b w:val="0"/>
-                <w:i w:val="0"/>
-                <w:sz w:val="21"/>
-              </w:rPr>
-              <w:t>A. 29,30%.</w:t>
-            </w:r>
-          </w:p>
-        </w:tc>
-        <w:tc>
-          <w:tcPr>
-            <w:tcW w:type="dxa" w:w="2551"/>
-          </w:tcPr>
-          <w:p>
-            <w:pPr>
-              <w:spacing w:before="20" w:after="20"/>
-            </w:pPr>
-            <w:r>
-              <w:rPr>
-                <w:rFonts w:ascii="Times New Roman" w:hAnsi="Times New Roman"/>
-                <w:b w:val="0"/>
-                <w:i w:val="0"/>
-                <w:sz w:val="21"/>
-              </w:rPr>
-              <w:t>B. 60,78%.</w:t>
-            </w:r>
-          </w:p>
-        </w:tc>
-        <w:tc>
-          <w:tcPr>
-            <w:tcW w:type="dxa" w:w="2551"/>
-          </w:tcPr>
-          <w:p>
-            <w:pPr>
-              <w:spacing w:before="20" w:after="20"/>
-            </w:pPr>
-            <w:r>
-              <w:rPr>
-                <w:rFonts w:ascii="Times New Roman" w:hAnsi="Times New Roman"/>
-                <w:b w:val="0"/>
-                <w:i w:val="0"/>
-                <w:sz w:val="21"/>
-              </w:rPr>
-              <w:t>C. 66,67%.</w:t>
-            </w:r>
-          </w:p>
-        </w:tc>
-        <w:tc>
-          <w:tcPr>
-            <w:tcW w:type="dxa" w:w="2551"/>
-          </w:tcPr>
-          <w:p>
-            <w:pPr>
-              <w:spacing w:before="20" w:after="20"/>
-            </w:pPr>
-            <w:r>
-              <w:rPr>
-                <w:rFonts w:ascii="Times New Roman" w:hAnsi="Times New Roman"/>
-                <w:b w:val="0"/>
-                <w:i w:val="0"/>
-                <w:sz w:val="21"/>
-              </w:rPr>
-              <w:t>D. 72,27%.</w:t>
-            </w:r>
-          </w:p>
-        </w:tc>
-      </w:tr>
-    </w:tbl>
+    <w:p>
+      <w:pPr>
+        <w:tabs>
+          <w:tab w:pos="2551" w:val="left"/>
+          <w:tab w:pos="5102" w:val="left"/>
+          <w:tab w:pos="7654" w:val="left"/>
+        </w:tabs>
+        <w:spacing w:before="20" w:after="40"/>
+      </w:pPr>
+      <w:r>
+        <w:rPr>
+          <w:rFonts w:ascii="Times New Roman" w:hAnsi="Times New Roman"/>
+          <w:b w:val="0"/>
+          <w:i w:val="0"/>
+          <w:sz w:val="21"/>
+        </w:rPr>
+        <w:t>A. 29,30%.</w:t>
+      </w:r>
+      <w:r>
+        <w:tab/>
+      </w:r>
+      <w:r>
+        <w:rPr>
+          <w:rFonts w:ascii="Times New Roman" w:hAnsi="Times New Roman"/>
+          <w:b w:val="0"/>
+          <w:i w:val="0"/>
+          <w:sz w:val="21"/>
+        </w:rPr>
+        <w:t>B. 60,78%.</w:t>
+      </w:r>
+      <w:r>
+        <w:tab/>
+      </w:r>
+      <w:r>
+        <w:rPr>
+          <w:rFonts w:ascii="Times New Roman" w:hAnsi="Times New Roman"/>
+          <w:b w:val="0"/>
+          <w:i w:val="0"/>
+          <w:sz w:val="21"/>
+        </w:rPr>
+        <w:t>C. 66,67%.</w:t>
+      </w:r>
+      <w:r>
+        <w:tab/>
+      </w:r>
+      <w:r>
+        <w:rPr>
+          <w:rFonts w:ascii="Times New Roman" w:hAnsi="Times New Roman"/>
+          <w:b w:val="0"/>
+          <w:i w:val="0"/>
+          <w:sz w:val="21"/>
+        </w:rPr>
+        <w:t>D. 72,27%.</w:t>
+      </w:r>
+    </w:p>
     <w:p>
       <w:pPr>
         <w:spacing w:before="60" w:after="40"/>
@@ -1271,345 +1126,311 @@
         <w:t xml:space="preserve"> Chất nào sau đây không phải là ester?</w:t>
       </w:r>
     </w:p>
-    <w:tbl>
-      <w:tblPr>
-        <w:tblW w:type="auto" w:w="0"/>
-        <w:jc w:val="center"/>
-        <w:tblLayout w:type="fixed"/>
-        <w:tblLook w:firstColumn="1" w:firstRow="1" w:lastColumn="0" w:lastRow="0" w:noHBand="0" w:noVBand="1" w:val="04A0"/>
-      </w:tblPr>
-      <w:tblGrid>
-        <w:gridCol w:w="5103"/>
-        <w:gridCol w:w="5103"/>
-      </w:tblGrid>
-      <w:tr>
-        <w:tc>
-          <w:tcPr>
-            <w:tcW w:type="dxa" w:w="5102"/>
-          </w:tcPr>
-          <w:p>
-            <w:pPr>
-              <w:spacing w:before="20" w:after="20"/>
-            </w:pPr>
-            <w:r>
-              <w:rPr>
-                <w:rFonts w:ascii="Times New Roman" w:hAnsi="Times New Roman"/>
-                <w:b w:val="0"/>
-                <w:i w:val="0"/>
-                <w:sz w:val="21"/>
-              </w:rPr>
-              <w:t>A. HCOOCH</w:t>
-            </w:r>
-            <w:r>
-              <w:rPr>
-                <w:rFonts w:ascii="Times New Roman" w:hAnsi="Times New Roman"/>
-                <w:b w:val="0"/>
-                <w:i w:val="0"/>
-                <w:sz w:val="21"/>
-                <w:vertAlign w:val="subscript"/>
-              </w:rPr>
-              <w:t>3</w:t>
-            </w:r>
-            <w:r>
-              <w:rPr>
-                <w:rFonts w:ascii="Times New Roman" w:hAnsi="Times New Roman"/>
-                <w:b w:val="0"/>
-                <w:i w:val="0"/>
-                <w:sz w:val="21"/>
-              </w:rPr>
-              <w:t>.</w:t>
-            </w:r>
-          </w:p>
-        </w:tc>
-        <w:tc>
-          <w:tcPr>
-            <w:tcW w:type="dxa" w:w="5102"/>
-          </w:tcPr>
-          <w:p>
-            <w:pPr>
-              <w:spacing w:before="20" w:after="20"/>
-            </w:pPr>
-            <w:r>
-              <w:rPr>
-                <w:rFonts w:ascii="Times New Roman" w:hAnsi="Times New Roman"/>
-                <w:b w:val="0"/>
-                <w:i w:val="0"/>
-                <w:sz w:val="21"/>
-              </w:rPr>
-              <w:t>B. C</w:t>
-            </w:r>
-            <w:r>
-              <w:rPr>
-                <w:rFonts w:ascii="Times New Roman" w:hAnsi="Times New Roman"/>
-                <w:b w:val="0"/>
-                <w:i w:val="0"/>
-                <w:sz w:val="21"/>
-                <w:vertAlign w:val="subscript"/>
-              </w:rPr>
-              <w:t>2</w:t>
-            </w:r>
-            <w:r>
-              <w:rPr>
-                <w:rFonts w:ascii="Times New Roman" w:hAnsi="Times New Roman"/>
-                <w:b w:val="0"/>
-                <w:i w:val="0"/>
-                <w:sz w:val="21"/>
-              </w:rPr>
-              <w:t>H</w:t>
-            </w:r>
-            <w:r>
-              <w:rPr>
-                <w:rFonts w:ascii="Times New Roman" w:hAnsi="Times New Roman"/>
-                <w:b w:val="0"/>
-                <w:i w:val="0"/>
-                <w:sz w:val="21"/>
-                <w:vertAlign w:val="subscript"/>
-              </w:rPr>
-              <w:t>5</w:t>
-            </w:r>
-            <w:r>
-              <w:rPr>
-                <w:rFonts w:ascii="Times New Roman" w:hAnsi="Times New Roman"/>
-                <w:b w:val="0"/>
-                <w:i w:val="0"/>
-                <w:sz w:val="21"/>
-              </w:rPr>
-              <w:t>COC</w:t>
-            </w:r>
-            <w:r>
-              <w:rPr>
-                <w:rFonts w:ascii="Times New Roman" w:hAnsi="Times New Roman"/>
-                <w:b w:val="0"/>
-                <w:i w:val="0"/>
-                <w:sz w:val="21"/>
-                <w:vertAlign w:val="subscript"/>
-              </w:rPr>
-              <w:t>3</w:t>
-            </w:r>
-            <w:r>
-              <w:rPr>
-                <w:rFonts w:ascii="Times New Roman" w:hAnsi="Times New Roman"/>
-                <w:b w:val="0"/>
-                <w:i w:val="0"/>
-                <w:sz w:val="21"/>
-              </w:rPr>
-              <w:t>H</w:t>
-            </w:r>
-            <w:r>
-              <w:rPr>
-                <w:rFonts w:ascii="Times New Roman" w:hAnsi="Times New Roman"/>
-                <w:b w:val="0"/>
-                <w:i w:val="0"/>
-                <w:sz w:val="21"/>
-                <w:vertAlign w:val="subscript"/>
-              </w:rPr>
-              <w:t>7</w:t>
-            </w:r>
-            <w:r>
-              <w:rPr>
-                <w:rFonts w:ascii="Times New Roman" w:hAnsi="Times New Roman"/>
-                <w:b w:val="0"/>
-                <w:i w:val="0"/>
-                <w:sz w:val="21"/>
-              </w:rPr>
-              <w:t>.</w:t>
-            </w:r>
-          </w:p>
-        </w:tc>
-      </w:tr>
-      <w:tr>
-        <w:tc>
-          <w:tcPr>
-            <w:tcW w:type="dxa" w:w="5102"/>
-          </w:tcPr>
-          <w:p>
-            <w:pPr>
-              <w:spacing w:before="20" w:after="20"/>
-            </w:pPr>
-            <w:r>
-              <w:rPr>
-                <w:rFonts w:ascii="Times New Roman" w:hAnsi="Times New Roman"/>
-                <w:b w:val="0"/>
-                <w:i w:val="0"/>
-                <w:sz w:val="21"/>
-              </w:rPr>
-              <w:t>C. CH</w:t>
-            </w:r>
-            <w:r>
-              <w:rPr>
-                <w:rFonts w:ascii="Times New Roman" w:hAnsi="Times New Roman"/>
-                <w:b w:val="0"/>
-                <w:i w:val="0"/>
-                <w:sz w:val="21"/>
-                <w:vertAlign w:val="subscript"/>
-              </w:rPr>
-              <w:t>3</w:t>
-            </w:r>
-            <w:r>
-              <w:rPr>
-                <w:rFonts w:ascii="Times New Roman" w:hAnsi="Times New Roman"/>
-                <w:b w:val="0"/>
-                <w:i w:val="0"/>
-                <w:sz w:val="21"/>
-              </w:rPr>
-              <w:t>COOC</w:t>
-            </w:r>
-            <w:r>
-              <w:rPr>
-                <w:rFonts w:ascii="Times New Roman" w:hAnsi="Times New Roman"/>
-                <w:b w:val="0"/>
-                <w:i w:val="0"/>
-                <w:sz w:val="21"/>
-                <w:vertAlign w:val="subscript"/>
-              </w:rPr>
-              <w:t>2</w:t>
-            </w:r>
-            <w:r>
-              <w:rPr>
-                <w:rFonts w:ascii="Times New Roman" w:hAnsi="Times New Roman"/>
-                <w:b w:val="0"/>
-                <w:i w:val="0"/>
-                <w:sz w:val="21"/>
-              </w:rPr>
-              <w:t>H</w:t>
-            </w:r>
-            <w:r>
-              <w:rPr>
-                <w:rFonts w:ascii="Times New Roman" w:hAnsi="Times New Roman"/>
-                <w:b w:val="0"/>
-                <w:i w:val="0"/>
-                <w:sz w:val="21"/>
-                <w:vertAlign w:val="subscript"/>
-              </w:rPr>
-              <w:t>5</w:t>
-            </w:r>
-            <w:r>
-              <w:rPr>
-                <w:rFonts w:ascii="Times New Roman" w:hAnsi="Times New Roman"/>
-                <w:b w:val="0"/>
-                <w:i w:val="0"/>
-                <w:sz w:val="21"/>
-              </w:rPr>
-              <w:t>.</w:t>
-            </w:r>
-          </w:p>
-        </w:tc>
-        <w:tc>
-          <w:tcPr>
-            <w:tcW w:type="dxa" w:w="5102"/>
-          </w:tcPr>
-          <w:p>
-            <w:pPr>
-              <w:spacing w:before="20" w:after="20"/>
-            </w:pPr>
-            <w:r>
-              <w:rPr>
-                <w:rFonts w:ascii="Times New Roman" w:hAnsi="Times New Roman"/>
-                <w:b w:val="0"/>
-                <w:i w:val="0"/>
-                <w:sz w:val="21"/>
-              </w:rPr>
-              <w:t>D. (C</w:t>
-            </w:r>
-            <w:r>
-              <w:rPr>
-                <w:rFonts w:ascii="Times New Roman" w:hAnsi="Times New Roman"/>
-                <w:b w:val="0"/>
-                <w:i w:val="0"/>
-                <w:sz w:val="21"/>
-                <w:vertAlign w:val="subscript"/>
-              </w:rPr>
-              <w:t>15</w:t>
-            </w:r>
-            <w:r>
-              <w:rPr>
-                <w:rFonts w:ascii="Times New Roman" w:hAnsi="Times New Roman"/>
-                <w:b w:val="0"/>
-                <w:i w:val="0"/>
-                <w:sz w:val="21"/>
-              </w:rPr>
-              <w:t>H</w:t>
-            </w:r>
-            <w:r>
-              <w:rPr>
-                <w:rFonts w:ascii="Times New Roman" w:hAnsi="Times New Roman"/>
-                <w:b w:val="0"/>
-                <w:i w:val="0"/>
-                <w:sz w:val="21"/>
-                <w:vertAlign w:val="subscript"/>
-              </w:rPr>
-              <w:t>31</w:t>
-            </w:r>
-            <w:r>
-              <w:rPr>
-                <w:rFonts w:ascii="Times New Roman" w:hAnsi="Times New Roman"/>
-                <w:b w:val="0"/>
-                <w:i w:val="0"/>
-                <w:sz w:val="21"/>
-              </w:rPr>
-              <w:t>COO)</w:t>
-            </w:r>
-            <w:r>
-              <w:rPr>
-                <w:rFonts w:ascii="Times New Roman" w:hAnsi="Times New Roman"/>
-                <w:b w:val="0"/>
-                <w:i w:val="0"/>
-                <w:sz w:val="21"/>
-                <w:vertAlign w:val="subscript"/>
-              </w:rPr>
-              <w:t>3</w:t>
-            </w:r>
-            <w:r>
-              <w:rPr>
-                <w:rFonts w:ascii="Times New Roman" w:hAnsi="Times New Roman"/>
-                <w:b w:val="0"/>
-                <w:i w:val="0"/>
-                <w:sz w:val="21"/>
-              </w:rPr>
-              <w:t>C</w:t>
-            </w:r>
-            <w:r>
-              <w:rPr>
-                <w:rFonts w:ascii="Times New Roman" w:hAnsi="Times New Roman"/>
-                <w:b w:val="0"/>
-                <w:i w:val="0"/>
-                <w:sz w:val="21"/>
-                <w:vertAlign w:val="subscript"/>
-              </w:rPr>
-              <w:t>3</w:t>
-            </w:r>
-            <w:r>
-              <w:rPr>
-                <w:rFonts w:ascii="Times New Roman" w:hAnsi="Times New Roman"/>
-                <w:b w:val="0"/>
-                <w:i w:val="0"/>
-                <w:sz w:val="21"/>
-              </w:rPr>
-              <w:t>H</w:t>
-            </w:r>
-            <w:r>
-              <w:rPr>
-                <w:rFonts w:ascii="Times New Roman" w:hAnsi="Times New Roman"/>
-                <w:b w:val="0"/>
-                <w:i w:val="0"/>
-                <w:sz w:val="21"/>
-                <w:vertAlign w:val="subscript"/>
-              </w:rPr>
-              <w:t>5</w:t>
-            </w:r>
-            <w:r>
-              <w:rPr>
-                <w:rFonts w:ascii="Times New Roman" w:hAnsi="Times New Roman"/>
-                <w:b w:val="0"/>
-                <w:i w:val="0"/>
-                <w:sz w:val="21"/>
-              </w:rPr>
-              <w:t>.</w:t>
-            </w:r>
-          </w:p>
-        </w:tc>
-      </w:tr>
-    </w:tbl>
+    <w:p>
+      <w:pPr>
+        <w:tabs>
+          <w:tab w:pos="5102" w:val="left"/>
+        </w:tabs>
+        <w:spacing w:before="20" w:after="20"/>
+      </w:pPr>
+      <w:r>
+        <w:rPr>
+          <w:rFonts w:ascii="Times New Roman" w:hAnsi="Times New Roman"/>
+          <w:b w:val="0"/>
+          <w:i w:val="0"/>
+          <w:sz w:val="21"/>
+        </w:rPr>
+        <w:t>A. HCOOCH</w:t>
+      </w:r>
+      <w:r>
+        <w:rPr>
+          <w:rFonts w:ascii="Times New Roman" w:hAnsi="Times New Roman"/>
+          <w:b w:val="0"/>
+          <w:i w:val="0"/>
+          <w:sz w:val="21"/>
+          <w:vertAlign w:val="subscript"/>
+        </w:rPr>
+        <w:t>3</w:t>
+      </w:r>
+      <w:r>
+        <w:rPr>
+          <w:rFonts w:ascii="Times New Roman" w:hAnsi="Times New Roman"/>
+          <w:b w:val="0"/>
+          <w:i w:val="0"/>
+          <w:sz w:val="21"/>
+        </w:rPr>
+        <w:t>.</w:t>
+      </w:r>
+      <w:r>
+        <w:tab/>
+      </w:r>
+      <w:r>
+        <w:rPr>
+          <w:rFonts w:ascii="Times New Roman" w:hAnsi="Times New Roman"/>
+          <w:b w:val="0"/>
+          <w:i w:val="0"/>
+          <w:sz w:val="21"/>
+        </w:rPr>
+        <w:t>B. C</w:t>
+      </w:r>
+      <w:r>
+        <w:rPr>
+          <w:rFonts w:ascii="Times New Roman" w:hAnsi="Times New Roman"/>
+          <w:b w:val="0"/>
+          <w:i w:val="0"/>
+          <w:sz w:val="21"/>
+          <w:vertAlign w:val="subscript"/>
+        </w:rPr>
+        <w:t>2</w:t>
+      </w:r>
+      <w:r>
+        <w:rPr>
+          <w:rFonts w:ascii="Times New Roman" w:hAnsi="Times New Roman"/>
+          <w:b w:val="0"/>
+          <w:i w:val="0"/>
+          <w:sz w:val="21"/>
+        </w:rPr>
+        <w:t>H</w:t>
+      </w:r>
+      <w:r>
+        <w:rPr>
+          <w:rFonts w:ascii="Times New Roman" w:hAnsi="Times New Roman"/>
+          <w:b w:val="0"/>
+          <w:i w:val="0"/>
+          <w:sz w:val="21"/>
+          <w:vertAlign w:val="subscript"/>
+        </w:rPr>
+        <w:t>5</w:t>
+      </w:r>
+      <w:r>
+        <w:rPr>
+          <w:rFonts w:ascii="Times New Roman" w:hAnsi="Times New Roman"/>
+          <w:b w:val="0"/>
+          <w:i w:val="0"/>
+          <w:sz w:val="21"/>
+        </w:rPr>
+        <w:t>COC</w:t>
+      </w:r>
+      <w:r>
+        <w:rPr>
+          <w:rFonts w:ascii="Times New Roman" w:hAnsi="Times New Roman"/>
+          <w:b w:val="0"/>
+          <w:i w:val="0"/>
+          <w:sz w:val="21"/>
+          <w:vertAlign w:val="subscript"/>
+        </w:rPr>
+        <w:t>3</w:t>
+      </w:r>
+      <w:r>
+        <w:rPr>
+          <w:rFonts w:ascii="Times New Roman" w:hAnsi="Times New Roman"/>
+          <w:b w:val="0"/>
+          <w:i w:val="0"/>
+          <w:sz w:val="21"/>
+        </w:rPr>
+        <w:t>H</w:t>
+      </w:r>
+      <w:r>
+        <w:rPr>
+          <w:rFonts w:ascii="Times New Roman" w:hAnsi="Times New Roman"/>
+          <w:b w:val="0"/>
+          <w:i w:val="0"/>
+          <w:sz w:val="21"/>
+          <w:vertAlign w:val="subscript"/>
+        </w:rPr>
+        <w:t>7</w:t>
+      </w:r>
+      <w:r>
+        <w:rPr>
+          <w:rFonts w:ascii="Times New Roman" w:hAnsi="Times New Roman"/>
+          <w:b w:val="0"/>
+          <w:i w:val="0"/>
+          <w:sz w:val="21"/>
+        </w:rPr>
+        <w:t>.</w:t>
+      </w:r>
+    </w:p>
+    <w:p>
+      <w:pPr>
+        <w:tabs>
+          <w:tab w:pos="5102" w:val="left"/>
+        </w:tabs>
+        <w:spacing w:before="20" w:after="40"/>
+      </w:pPr>
+      <w:r>
+        <w:rPr>
+          <w:rFonts w:ascii="Times New Roman" w:hAnsi="Times New Roman"/>
+          <w:b w:val="0"/>
+          <w:i w:val="0"/>
+          <w:sz w:val="21"/>
+        </w:rPr>
+        <w:t>C. CH</w:t>
+      </w:r>
+      <w:r>
+        <w:rPr>
+          <w:rFonts w:ascii="Times New Roman" w:hAnsi="Times New Roman"/>
+          <w:b w:val="0"/>
+          <w:i w:val="0"/>
+          <w:sz w:val="21"/>
+          <w:vertAlign w:val="subscript"/>
+        </w:rPr>
+        <w:t>3</w:t>
+      </w:r>
+      <w:r>
+        <w:rPr>
+          <w:rFonts w:ascii="Times New Roman" w:hAnsi="Times New Roman"/>
+          <w:b w:val="0"/>
+          <w:i w:val="0"/>
+          <w:sz w:val="21"/>
+        </w:rPr>
+        <w:t>COOC</w:t>
+      </w:r>
+      <w:r>
+        <w:rPr>
+          <w:rFonts w:ascii="Times New Roman" w:hAnsi="Times New Roman"/>
+          <w:b w:val="0"/>
+          <w:i w:val="0"/>
+          <w:sz w:val="21"/>
+          <w:vertAlign w:val="subscript"/>
+        </w:rPr>
+        <w:t>2</w:t>
+      </w:r>
+      <w:r>
+        <w:rPr>
+          <w:rFonts w:ascii="Times New Roman" w:hAnsi="Times New Roman"/>
+          <w:b w:val="0"/>
+          <w:i w:val="0"/>
+          <w:sz w:val="21"/>
+        </w:rPr>
+        <w:t>H</w:t>
+      </w:r>
+      <w:r>
+        <w:rPr>
+          <w:rFonts w:ascii="Times New Roman" w:hAnsi="Times New Roman"/>
+          <w:b w:val="0"/>
+          <w:i w:val="0"/>
+          <w:sz w:val="21"/>
+          <w:vertAlign w:val="subscript"/>
+        </w:rPr>
+        <w:t>5</w:t>
+      </w:r>
+      <w:r>
+        <w:rPr>
+          <w:rFonts w:ascii="Times New Roman" w:hAnsi="Times New Roman"/>
+          <w:b w:val="0"/>
+          <w:i w:val="0"/>
+          <w:sz w:val="21"/>
+        </w:rPr>
+        <w:t>.</w:t>
+      </w:r>
+      <w:r>
+        <w:tab/>
+      </w:r>
+      <w:r>
+        <w:rPr>
+          <w:rFonts w:ascii="Times New Roman" w:hAnsi="Times New Roman"/>
+          <w:b w:val="0"/>
+          <w:i w:val="0"/>
+          <w:sz w:val="21"/>
+        </w:rPr>
+        <w:t>D. (C</w:t>
+      </w:r>
+      <w:r>
+        <w:rPr>
+          <w:rFonts w:ascii="Times New Roman" w:hAnsi="Times New Roman"/>
+          <w:b w:val="0"/>
+          <w:i w:val="0"/>
+          <w:sz w:val="21"/>
+          <w:vertAlign w:val="subscript"/>
+        </w:rPr>
+        <w:t>15</w:t>
+      </w:r>
+      <w:r>
+        <w:rPr>
+          <w:rFonts w:ascii="Times New Roman" w:hAnsi="Times New Roman"/>
+          <w:b w:val="0"/>
+          <w:i w:val="0"/>
+          <w:sz w:val="21"/>
+        </w:rPr>
+        <w:t>H</w:t>
+      </w:r>
+      <w:r>
+        <w:rPr>
+          <w:rFonts w:ascii="Times New Roman" w:hAnsi="Times New Roman"/>
+          <w:b w:val="0"/>
+          <w:i w:val="0"/>
+          <w:sz w:val="21"/>
+          <w:vertAlign w:val="subscript"/>
+        </w:rPr>
+        <w:t>31</w:t>
+      </w:r>
+      <w:r>
+        <w:rPr>
+          <w:rFonts w:ascii="Times New Roman" w:hAnsi="Times New Roman"/>
+          <w:b w:val="0"/>
+          <w:i w:val="0"/>
+          <w:sz w:val="21"/>
+        </w:rPr>
+        <w:t>COO)</w:t>
+      </w:r>
+      <w:r>
+        <w:rPr>
+          <w:rFonts w:ascii="Times New Roman" w:hAnsi="Times New Roman"/>
+          <w:b w:val="0"/>
+          <w:i w:val="0"/>
+          <w:sz w:val="21"/>
+          <w:vertAlign w:val="subscript"/>
+        </w:rPr>
+        <w:t>3</w:t>
+      </w:r>
+      <w:r>
+        <w:rPr>
+          <w:rFonts w:ascii="Times New Roman" w:hAnsi="Times New Roman"/>
+          <w:b w:val="0"/>
+          <w:i w:val="0"/>
+          <w:sz w:val="21"/>
+        </w:rPr>
+        <w:t>C</w:t>
+      </w:r>
+      <w:r>
+        <w:rPr>
+          <w:rFonts w:ascii="Times New Roman" w:hAnsi="Times New Roman"/>
+          <w:b w:val="0"/>
+          <w:i w:val="0"/>
+          <w:sz w:val="21"/>
+          <w:vertAlign w:val="subscript"/>
+        </w:rPr>
+        <w:t>3</w:t>
+      </w:r>
+      <w:r>
+        <w:rPr>
+          <w:rFonts w:ascii="Times New Roman" w:hAnsi="Times New Roman"/>
+          <w:b w:val="0"/>
+          <w:i w:val="0"/>
+          <w:sz w:val="21"/>
+        </w:rPr>
+        <w:t>H</w:t>
+      </w:r>
+      <w:r>
+        <w:rPr>
+          <w:rFonts w:ascii="Times New Roman" w:hAnsi="Times New Roman"/>
+          <w:b w:val="0"/>
+          <w:i w:val="0"/>
+          <w:sz w:val="21"/>
+          <w:vertAlign w:val="subscript"/>
+        </w:rPr>
+        <w:t>5</w:t>
+      </w:r>
+      <w:r>
+        <w:rPr>
+          <w:rFonts w:ascii="Times New Roman" w:hAnsi="Times New Roman"/>
+          <w:b w:val="0"/>
+          <w:i w:val="0"/>
+          <w:sz w:val="21"/>
+        </w:rPr>
+        <w:t>.</w:t>
+      </w:r>
+    </w:p>
     <w:p>
       <w:pPr>
         <w:spacing w:before="60" w:after="40"/>
@@ -1645,98 +1466,61 @@
         <w:t>Số phát biểu đúng là:</w:t>
       </w:r>
     </w:p>
-    <w:tbl>
-      <w:tblPr>
-        <w:tblW w:type="auto" w:w="0"/>
-        <w:jc w:val="center"/>
-        <w:tblLayout w:type="fixed"/>
-        <w:tblLook w:firstColumn="1" w:firstRow="1" w:lastColumn="0" w:lastRow="0" w:noHBand="0" w:noVBand="1" w:val="04A0"/>
-      </w:tblPr>
-      <w:tblGrid>
-        <w:gridCol w:w="2551"/>
-        <w:gridCol w:w="2551"/>
-        <w:gridCol w:w="2551"/>
-        <w:gridCol w:w="2551"/>
-      </w:tblGrid>
-      <w:tr>
-        <w:tc>
-          <w:tcPr>
-            <w:tcW w:type="dxa" w:w="2551"/>
-          </w:tcPr>
-          <w:p>
-            <w:pPr>
-              <w:spacing w:before="20" w:after="20"/>
-            </w:pPr>
-            <w:r>
-              <w:rPr>
-                <w:rFonts w:ascii="Times New Roman" w:hAnsi="Times New Roman"/>
-                <w:b w:val="0"/>
-                <w:i w:val="0"/>
-                <w:sz w:val="21"/>
-              </w:rPr>
-              <w:t>A. 2.</w:t>
-            </w:r>
-          </w:p>
-        </w:tc>
-        <w:tc>
-          <w:tcPr>
-            <w:tcW w:type="dxa" w:w="2551"/>
-          </w:tcPr>
-          <w:p>
-            <w:pPr>
-              <w:spacing w:before="20" w:after="20"/>
-            </w:pPr>
-            <w:r>
-              <w:rPr>
-                <w:rFonts w:ascii="Times New Roman" w:hAnsi="Times New Roman"/>
-                <w:b w:val="0"/>
-                <w:i w:val="0"/>
-                <w:sz w:val="21"/>
-              </w:rPr>
-              <w:t>B. 3.</w:t>
-            </w:r>
-          </w:p>
-        </w:tc>
-        <w:tc>
-          <w:tcPr>
-            <w:tcW w:type="dxa" w:w="2551"/>
-          </w:tcPr>
-          <w:p>
-            <w:pPr>
-              <w:spacing w:before="20" w:after="20"/>
-            </w:pPr>
-            <w:r>
-              <w:rPr>
-                <w:rFonts w:ascii="Times New Roman" w:hAnsi="Times New Roman"/>
-                <w:b w:val="0"/>
-                <w:i w:val="0"/>
-                <w:sz w:val="21"/>
-              </w:rPr>
-              <w:t>C. 4.</w:t>
-            </w:r>
-          </w:p>
-        </w:tc>
-        <w:tc>
-          <w:tcPr>
-            <w:tcW w:type="dxa" w:w="2551"/>
-          </w:tcPr>
-          <w:p>
-            <w:pPr>
-              <w:spacing w:before="20" w:after="20"/>
-            </w:pPr>
-            <w:r>
-              <w:rPr>
-                <w:rFonts w:ascii="Times New Roman" w:hAnsi="Times New Roman"/>
-                <w:b w:val="0"/>
-                <w:i w:val="0"/>
-                <w:sz w:val="21"/>
-              </w:rPr>
-              <w:t>D. 5.</w:t>
-            </w:r>
-          </w:p>
-        </w:tc>
-      </w:tr>
-    </w:tbl>
+    <w:p>
+      <w:pPr>
+        <w:tabs>
+          <w:tab w:pos="2551" w:val="left"/>
+          <w:tab w:pos="5102" w:val="left"/>
+          <w:tab w:pos="7654" w:val="left"/>
+        </w:tabs>
+        <w:spacing w:before="20" w:after="40"/>
+      </w:pPr>
+      <w:r>
+        <w:rPr>
+          <w:rFonts w:ascii="Times New Roman" w:hAnsi="Times New Roman"/>
+          <w:b w:val="0"/>
+          <w:i w:val="0"/>
+          <w:sz w:val="21"/>
+        </w:rPr>
+        <w:t>A. 2.</w:t>
+      </w:r>
+      <w:r>
+        <w:tab/>
+      </w:r>
+      <w:r>
+        <w:rPr>
+          <w:rFonts w:ascii="Times New Roman" w:hAnsi="Times New Roman"/>
+          <w:b w:val="0"/>
+          <w:i w:val="0"/>
+          <w:sz w:val="21"/>
+        </w:rPr>
+        <w:t>B. 3.</w:t>
+      </w:r>
+      <w:r>
+        <w:tab/>
+      </w:r>
+      <w:r>
+        <w:rPr>
+          <w:rFonts w:ascii="Times New Roman" w:hAnsi="Times New Roman"/>
+          <w:b w:val="0"/>
+          <w:i w:val="0"/>
+          <w:sz w:val="21"/>
+        </w:rPr>
+        <w:t>C. 4.</w:t>
+      </w:r>
+      <w:r>
+        <w:tab/>
+      </w:r>
+      <w:r>
+        <w:rPr>
+          <w:rFonts w:ascii="Times New Roman" w:hAnsi="Times New Roman"/>
+          <w:b w:val="0"/>
+          <w:i w:val="0"/>
+          <w:sz w:val="21"/>
+        </w:rPr>
+        <w:t>D. 5.</w:t>
+      </w:r>
+    </w:p>
     <w:p>
       <w:pPr>
         <w:spacing w:before="60" w:after="40"/>
@@ -1836,98 +1620,64 @@
         <w:t>)-COOH là</w:t>
       </w:r>
     </w:p>
-    <w:tbl>
-      <w:tblPr>
-        <w:tblW w:type="auto" w:w="0"/>
-        <w:jc w:val="center"/>
-        <w:tblLayout w:type="fixed"/>
-        <w:tblLook w:firstColumn="1" w:firstRow="1" w:lastColumn="0" w:lastRow="0" w:noHBand="0" w:noVBand="1" w:val="04A0"/>
-      </w:tblPr>
-      <w:tblGrid>
-        <w:gridCol w:w="5103"/>
-        <w:gridCol w:w="5103"/>
-      </w:tblGrid>
-      <w:tr>
-        <w:tc>
-          <w:tcPr>
-            <w:tcW w:type="dxa" w:w="5102"/>
-          </w:tcPr>
-          <w:p>
-            <w:pPr>
-              <w:spacing w:before="20" w:after="20"/>
-            </w:pPr>
-            <w:r>
-              <w:rPr>
-                <w:rFonts w:ascii="Times New Roman" w:hAnsi="Times New Roman"/>
-                <w:b w:val="0"/>
-                <w:i w:val="0"/>
-                <w:sz w:val="21"/>
-              </w:rPr>
-              <w:t>A. Amino phenyl propionic acid.</w:t>
-            </w:r>
-          </w:p>
-        </w:tc>
-        <w:tc>
-          <w:tcPr>
-            <w:tcW w:type="dxa" w:w="5102"/>
-          </w:tcPr>
-          <w:p>
-            <w:pPr>
-              <w:spacing w:before="20" w:after="20"/>
-            </w:pPr>
-            <w:r>
-              <w:rPr>
-                <w:rFonts w:ascii="Times New Roman" w:hAnsi="Times New Roman"/>
-                <w:b w:val="0"/>
-                <w:i w:val="0"/>
-                <w:sz w:val="21"/>
-              </w:rPr>
-              <w:t>B. phenylalanine.</w:t>
-            </w:r>
-          </w:p>
-        </w:tc>
-      </w:tr>
-      <w:tr>
-        <w:tc>
-          <w:tcPr>
-            <w:tcW w:type="dxa" w:w="5102"/>
-          </w:tcPr>
-          <w:p>
-            <w:pPr>
-              <w:spacing w:before="20" w:after="20"/>
-            </w:pPr>
-            <w:r>
-              <w:rPr>
-                <w:rFonts w:ascii="Times New Roman" w:hAnsi="Times New Roman"/>
-                <w:b w:val="0"/>
-                <w:i w:val="0"/>
-                <w:sz w:val="21"/>
-              </w:rPr>
-              <w:t>C. 2-amino-3-phenylpropionic acid.</w:t>
-            </w:r>
-          </w:p>
-        </w:tc>
-        <w:tc>
-          <w:tcPr>
-            <w:tcW w:type="dxa" w:w="5102"/>
-          </w:tcPr>
-          <w:p>
-            <w:pPr>
-              <w:spacing w:before="20" w:after="20"/>
-            </w:pPr>
-            <w:r>
-              <w:rPr>
-                <w:rFonts w:ascii="Times New Roman" w:hAnsi="Times New Roman"/>
-                <w:b w:val="0"/>
-                <w:i w:val="0"/>
-                <w:sz w:val="21"/>
-              </w:rPr>
-              <w:t>D. 2-amino-3-phenylpropanoic acid</w:t>
-            </w:r>
-          </w:p>
-        </w:tc>
-      </w:tr>
-    </w:tbl>
+    <w:p>
+      <w:pPr>
+        <w:tabs>
+          <w:tab w:pos="5102" w:val="left"/>
+        </w:tabs>
+        <w:spacing w:before="20" w:after="20"/>
+      </w:pPr>
+      <w:r>
+        <w:rPr>
+          <w:rFonts w:ascii="Times New Roman" w:hAnsi="Times New Roman"/>
+          <w:b w:val="0"/>
+          <w:i w:val="0"/>
+          <w:sz w:val="21"/>
+        </w:rPr>
+        <w:t>A. Amino phenyl propionic acid.</w:t>
+      </w:r>
+      <w:r>
+        <w:tab/>
+      </w:r>
+      <w:r>
+        <w:rPr>
+          <w:rFonts w:ascii="Times New Roman" w:hAnsi="Times New Roman"/>
+          <w:b w:val="0"/>
+          <w:i w:val="0"/>
+          <w:sz w:val="21"/>
+        </w:rPr>
+        <w:t>B. phenylalanine.</w:t>
+      </w:r>
+    </w:p>
+    <w:p>
+      <w:pPr>
+        <w:tabs>
+          <w:tab w:pos="5102" w:val="left"/>
+        </w:tabs>
+        <w:spacing w:before="20" w:after="40"/>
+      </w:pPr>
+      <w:r>
+        <w:rPr>
+          <w:rFonts w:ascii="Times New Roman" w:hAnsi="Times New Roman"/>
+          <w:b w:val="0"/>
+          <w:i w:val="0"/>
+          <w:sz w:val="21"/>
+        </w:rPr>
+        <w:t>C. 2-amino-3-phenylpropionic acid.</w:t>
+      </w:r>
+      <w:r>
+        <w:tab/>
+      </w:r>
+      <w:r>
+        <w:rPr>
+          <w:rFonts w:ascii="Times New Roman" w:hAnsi="Times New Roman"/>
+          <w:b w:val="0"/>
+          <w:i w:val="0"/>
+          <w:sz w:val="21"/>
+        </w:rPr>
+        <w:t>D. 2-amino-3-phenylpropanoic acid</w:t>
+      </w:r>
+    </w:p>
     <w:p>
       <w:pPr>
         <w:spacing w:before="60" w:after="40"/>
@@ -1951,269 +1701,232 @@
         <w:t xml:space="preserve"> Công thức cấu tạo của glycine là</w:t>
       </w:r>
     </w:p>
-    <w:tbl>
-      <w:tblPr>
-        <w:tblW w:type="auto" w:w="0"/>
-        <w:jc w:val="center"/>
-        <w:tblLayout w:type="fixed"/>
-        <w:tblLook w:firstColumn="1" w:firstRow="1" w:lastColumn="0" w:lastRow="0" w:noHBand="0" w:noVBand="1" w:val="04A0"/>
-      </w:tblPr>
-      <w:tblGrid>
-        <w:gridCol w:w="5103"/>
-        <w:gridCol w:w="5103"/>
-      </w:tblGrid>
-      <w:tr>
-        <w:tc>
-          <w:tcPr>
-            <w:tcW w:type="dxa" w:w="5102"/>
-          </w:tcPr>
-          <w:p>
-            <w:pPr>
-              <w:spacing w:before="20" w:after="20"/>
-            </w:pPr>
-            <w:r>
-              <w:rPr>
-                <w:rFonts w:ascii="Times New Roman" w:hAnsi="Times New Roman"/>
-                <w:b w:val="0"/>
-                <w:i w:val="0"/>
-                <w:sz w:val="21"/>
-              </w:rPr>
-              <w:t>A. C</w:t>
-            </w:r>
-            <w:r>
-              <w:rPr>
-                <w:rFonts w:ascii="Times New Roman" w:hAnsi="Times New Roman"/>
-                <w:b w:val="0"/>
-                <w:i w:val="0"/>
-                <w:sz w:val="21"/>
-                <w:vertAlign w:val="subscript"/>
-              </w:rPr>
-              <w:t>2</w:t>
-            </w:r>
-            <w:r>
-              <w:rPr>
-                <w:rFonts w:ascii="Times New Roman" w:hAnsi="Times New Roman"/>
-                <w:b w:val="0"/>
-                <w:i w:val="0"/>
-                <w:sz w:val="21"/>
-              </w:rPr>
-              <w:t>H</w:t>
-            </w:r>
-            <w:r>
-              <w:rPr>
-                <w:rFonts w:ascii="Times New Roman" w:hAnsi="Times New Roman"/>
-                <w:b w:val="0"/>
-                <w:i w:val="0"/>
-                <w:sz w:val="21"/>
-                <w:vertAlign w:val="subscript"/>
-              </w:rPr>
-              <w:t>5</w:t>
-            </w:r>
-            <w:r>
-              <w:rPr>
-                <w:rFonts w:ascii="Times New Roman" w:hAnsi="Times New Roman"/>
-                <w:b w:val="0"/>
-                <w:i w:val="0"/>
-                <w:sz w:val="21"/>
-              </w:rPr>
-              <w:t>NH</w:t>
-            </w:r>
-            <w:r>
-              <w:rPr>
-                <w:rFonts w:ascii="Times New Roman" w:hAnsi="Times New Roman"/>
-                <w:b w:val="0"/>
-                <w:i w:val="0"/>
-                <w:sz w:val="21"/>
-                <w:vertAlign w:val="subscript"/>
-              </w:rPr>
-              <w:t>2</w:t>
-            </w:r>
-            <w:r>
-              <w:rPr>
-                <w:rFonts w:ascii="Times New Roman" w:hAnsi="Times New Roman"/>
-                <w:b w:val="0"/>
-                <w:i w:val="0"/>
-                <w:sz w:val="21"/>
-              </w:rPr>
-              <w:t>.</w:t>
-            </w:r>
-          </w:p>
-        </w:tc>
-        <w:tc>
-          <w:tcPr>
-            <w:tcW w:type="dxa" w:w="5102"/>
-          </w:tcPr>
-          <w:p>
-            <w:pPr>
-              <w:spacing w:before="20" w:after="20"/>
-            </w:pPr>
-            <w:r>
-              <w:rPr>
-                <w:rFonts w:ascii="Times New Roman" w:hAnsi="Times New Roman"/>
-                <w:b w:val="0"/>
-                <w:i w:val="0"/>
-                <w:sz w:val="21"/>
-              </w:rPr>
-              <w:t>B. H</w:t>
-            </w:r>
-            <w:r>
-              <w:rPr>
-                <w:rFonts w:ascii="Times New Roman" w:hAnsi="Times New Roman"/>
-                <w:b w:val="0"/>
-                <w:i w:val="0"/>
-                <w:sz w:val="21"/>
-                <w:vertAlign w:val="subscript"/>
-              </w:rPr>
-              <w:t>2</w:t>
-            </w:r>
-            <w:r>
-              <w:rPr>
-                <w:rFonts w:ascii="Times New Roman" w:hAnsi="Times New Roman"/>
-                <w:b w:val="0"/>
-                <w:i w:val="0"/>
-                <w:sz w:val="21"/>
-              </w:rPr>
-              <w:t>NCH</w:t>
-            </w:r>
-            <w:r>
-              <w:rPr>
-                <w:rFonts w:ascii="Times New Roman" w:hAnsi="Times New Roman"/>
-                <w:b w:val="0"/>
-                <w:i w:val="0"/>
-                <w:sz w:val="21"/>
-                <w:vertAlign w:val="subscript"/>
-              </w:rPr>
-              <w:t>2</w:t>
-            </w:r>
-            <w:r>
-              <w:rPr>
-                <w:rFonts w:ascii="Times New Roman" w:hAnsi="Times New Roman"/>
-                <w:b w:val="0"/>
-                <w:i w:val="0"/>
-                <w:sz w:val="21"/>
-              </w:rPr>
-              <w:t>COOH.</w:t>
-            </w:r>
-          </w:p>
-        </w:tc>
-      </w:tr>
-      <w:tr>
-        <w:tc>
-          <w:tcPr>
-            <w:tcW w:type="dxa" w:w="5102"/>
-          </w:tcPr>
-          <w:p>
-            <w:pPr>
-              <w:spacing w:before="20" w:after="20"/>
-            </w:pPr>
-            <w:r>
-              <w:rPr>
-                <w:rFonts w:ascii="Times New Roman" w:hAnsi="Times New Roman"/>
-                <w:b w:val="0"/>
-                <w:i w:val="0"/>
-                <w:sz w:val="21"/>
-              </w:rPr>
-              <w:t>C. CH</w:t>
-            </w:r>
-            <w:r>
-              <w:rPr>
-                <w:rFonts w:ascii="Times New Roman" w:hAnsi="Times New Roman"/>
-                <w:b w:val="0"/>
-                <w:i w:val="0"/>
-                <w:sz w:val="21"/>
-                <w:vertAlign w:val="subscript"/>
-              </w:rPr>
-              <w:t>3</w:t>
-            </w:r>
-            <w:r>
-              <w:rPr>
-                <w:rFonts w:ascii="Times New Roman" w:hAnsi="Times New Roman"/>
-                <w:b w:val="0"/>
-                <w:i w:val="0"/>
-                <w:sz w:val="21"/>
-              </w:rPr>
-              <w:t>NH</w:t>
-            </w:r>
-            <w:r>
-              <w:rPr>
-                <w:rFonts w:ascii="Times New Roman" w:hAnsi="Times New Roman"/>
-                <w:b w:val="0"/>
-                <w:i w:val="0"/>
-                <w:sz w:val="21"/>
-                <w:vertAlign w:val="subscript"/>
-              </w:rPr>
-              <w:t>2</w:t>
-            </w:r>
-            <w:r>
-              <w:rPr>
-                <w:rFonts w:ascii="Times New Roman" w:hAnsi="Times New Roman"/>
-                <w:b w:val="0"/>
-                <w:i w:val="0"/>
-                <w:sz w:val="21"/>
-              </w:rPr>
-              <w:t>.</w:t>
-            </w:r>
-          </w:p>
-        </w:tc>
-        <w:tc>
-          <w:tcPr>
-            <w:tcW w:type="dxa" w:w="5102"/>
-          </w:tcPr>
-          <w:p>
-            <w:pPr>
-              <w:spacing w:before="20" w:after="20"/>
-            </w:pPr>
-            <w:r>
-              <w:rPr>
-                <w:rFonts w:ascii="Times New Roman" w:hAnsi="Times New Roman"/>
-                <w:b w:val="0"/>
-                <w:i w:val="0"/>
-                <w:sz w:val="21"/>
-              </w:rPr>
-              <w:t>D. H</w:t>
-            </w:r>
-            <w:r>
-              <w:rPr>
-                <w:rFonts w:ascii="Times New Roman" w:hAnsi="Times New Roman"/>
-                <w:b w:val="0"/>
-                <w:i w:val="0"/>
-                <w:sz w:val="21"/>
-                <w:vertAlign w:val="subscript"/>
-              </w:rPr>
-              <w:t>2</w:t>
-            </w:r>
-            <w:r>
-              <w:rPr>
-                <w:rFonts w:ascii="Times New Roman" w:hAnsi="Times New Roman"/>
-                <w:b w:val="0"/>
-                <w:i w:val="0"/>
-                <w:sz w:val="21"/>
-              </w:rPr>
-              <w:t>NCH(CH</w:t>
-            </w:r>
-            <w:r>
-              <w:rPr>
-                <w:rFonts w:ascii="Times New Roman" w:hAnsi="Times New Roman"/>
-                <w:b w:val="0"/>
-                <w:i w:val="0"/>
-                <w:sz w:val="21"/>
-                <w:vertAlign w:val="subscript"/>
-              </w:rPr>
-              <w:t>3</w:t>
-            </w:r>
-            <w:r>
-              <w:rPr>
-                <w:rFonts w:ascii="Times New Roman" w:hAnsi="Times New Roman"/>
-                <w:b w:val="0"/>
-                <w:i w:val="0"/>
-                <w:sz w:val="21"/>
-              </w:rPr>
-              <w:t>)COOH.</w:t>
-            </w:r>
-          </w:p>
-        </w:tc>
-      </w:tr>
-    </w:tbl>
+    <w:p>
+      <w:pPr>
+        <w:tabs>
+          <w:tab w:pos="2551" w:val="left"/>
+          <w:tab w:pos="5102" w:val="left"/>
+          <w:tab w:pos="7654" w:val="left"/>
+        </w:tabs>
+        <w:spacing w:before="20" w:after="40"/>
+      </w:pPr>
+      <w:r>
+        <w:rPr>
+          <w:rFonts w:ascii="Times New Roman" w:hAnsi="Times New Roman"/>
+          <w:b w:val="0"/>
+          <w:i w:val="0"/>
+          <w:sz w:val="21"/>
+        </w:rPr>
+        <w:t>A. C</w:t>
+      </w:r>
+      <w:r>
+        <w:rPr>
+          <w:rFonts w:ascii="Times New Roman" w:hAnsi="Times New Roman"/>
+          <w:b w:val="0"/>
+          <w:i w:val="0"/>
+          <w:sz w:val="21"/>
+          <w:vertAlign w:val="subscript"/>
+        </w:rPr>
+        <w:t>2</w:t>
+      </w:r>
+      <w:r>
+        <w:rPr>
+          <w:rFonts w:ascii="Times New Roman" w:hAnsi="Times New Roman"/>
+          <w:b w:val="0"/>
+          <w:i w:val="0"/>
+          <w:sz w:val="21"/>
+        </w:rPr>
+        <w:t>H</w:t>
+      </w:r>
+      <w:r>
+        <w:rPr>
+          <w:rFonts w:ascii="Times New Roman" w:hAnsi="Times New Roman"/>
+          <w:b w:val="0"/>
+          <w:i w:val="0"/>
+          <w:sz w:val="21"/>
+          <w:vertAlign w:val="subscript"/>
+        </w:rPr>
+        <w:t>5</w:t>
+      </w:r>
+      <w:r>
+        <w:rPr>
+          <w:rFonts w:ascii="Times New Roman" w:hAnsi="Times New Roman"/>
+          <w:b w:val="0"/>
+          <w:i w:val="0"/>
+          <w:sz w:val="21"/>
+        </w:rPr>
+        <w:t>NH</w:t>
+      </w:r>
+      <w:r>
+        <w:rPr>
+          <w:rFonts w:ascii="Times New Roman" w:hAnsi="Times New Roman"/>
+          <w:b w:val="0"/>
+          <w:i w:val="0"/>
+          <w:sz w:val="21"/>
+          <w:vertAlign w:val="subscript"/>
+        </w:rPr>
+        <w:t>2</w:t>
+      </w:r>
+      <w:r>
+        <w:rPr>
+          <w:rFonts w:ascii="Times New Roman" w:hAnsi="Times New Roman"/>
+          <w:b w:val="0"/>
+          <w:i w:val="0"/>
+          <w:sz w:val="21"/>
+        </w:rPr>
+        <w:t>.</w:t>
+      </w:r>
+      <w:r>
+        <w:tab/>
+      </w:r>
+      <w:r>
+        <w:rPr>
+          <w:rFonts w:ascii="Times New Roman" w:hAnsi="Times New Roman"/>
+          <w:b w:val="0"/>
+          <w:i w:val="0"/>
+          <w:sz w:val="21"/>
+        </w:rPr>
+        <w:t>B. H</w:t>
+      </w:r>
+      <w:r>
+        <w:rPr>
+          <w:rFonts w:ascii="Times New Roman" w:hAnsi="Times New Roman"/>
+          <w:b w:val="0"/>
+          <w:i w:val="0"/>
+          <w:sz w:val="21"/>
+          <w:vertAlign w:val="subscript"/>
+        </w:rPr>
+        <w:t>2</w:t>
+      </w:r>
+      <w:r>
+        <w:rPr>
+          <w:rFonts w:ascii="Times New Roman" w:hAnsi="Times New Roman"/>
+          <w:b w:val="0"/>
+          <w:i w:val="0"/>
+          <w:sz w:val="21"/>
+        </w:rPr>
+        <w:t>NCH</w:t>
+      </w:r>
+      <w:r>
+        <w:rPr>
+          <w:rFonts w:ascii="Times New Roman" w:hAnsi="Times New Roman"/>
+          <w:b w:val="0"/>
+          <w:i w:val="0"/>
+          <w:sz w:val="21"/>
+          <w:vertAlign w:val="subscript"/>
+        </w:rPr>
+        <w:t>2</w:t>
+      </w:r>
+      <w:r>
+        <w:rPr>
+          <w:rFonts w:ascii="Times New Roman" w:hAnsi="Times New Roman"/>
+          <w:b w:val="0"/>
+          <w:i w:val="0"/>
+          <w:sz w:val="21"/>
+        </w:rPr>
+        <w:t>COOH.</w:t>
+      </w:r>
+      <w:r>
+        <w:tab/>
+      </w:r>
+      <w:r>
+        <w:rPr>
+          <w:rFonts w:ascii="Times New Roman" w:hAnsi="Times New Roman"/>
+          <w:b w:val="0"/>
+          <w:i w:val="0"/>
+          <w:sz w:val="21"/>
+        </w:rPr>
+        <w:t>C. CH</w:t>
+      </w:r>
+      <w:r>
+        <w:rPr>
+          <w:rFonts w:ascii="Times New Roman" w:hAnsi="Times New Roman"/>
+          <w:b w:val="0"/>
+          <w:i w:val="0"/>
+          <w:sz w:val="21"/>
+          <w:vertAlign w:val="subscript"/>
+        </w:rPr>
+        <w:t>3</w:t>
+      </w:r>
+      <w:r>
+        <w:rPr>
+          <w:rFonts w:ascii="Times New Roman" w:hAnsi="Times New Roman"/>
+          <w:b w:val="0"/>
+          <w:i w:val="0"/>
+          <w:sz w:val="21"/>
+        </w:rPr>
+        <w:t>NH</w:t>
+      </w:r>
+      <w:r>
+        <w:rPr>
+          <w:rFonts w:ascii="Times New Roman" w:hAnsi="Times New Roman"/>
+          <w:b w:val="0"/>
+          <w:i w:val="0"/>
+          <w:sz w:val="21"/>
+          <w:vertAlign w:val="subscript"/>
+        </w:rPr>
+        <w:t>2</w:t>
+      </w:r>
+      <w:r>
+        <w:rPr>
+          <w:rFonts w:ascii="Times New Roman" w:hAnsi="Times New Roman"/>
+          <w:b w:val="0"/>
+          <w:i w:val="0"/>
+          <w:sz w:val="21"/>
+        </w:rPr>
+        <w:t>.</w:t>
+      </w:r>
+      <w:r>
+        <w:tab/>
+      </w:r>
+      <w:r>
+        <w:rPr>
+          <w:rFonts w:ascii="Times New Roman" w:hAnsi="Times New Roman"/>
+          <w:b w:val="0"/>
+          <w:i w:val="0"/>
+          <w:sz w:val="21"/>
+        </w:rPr>
+        <w:t>D. H</w:t>
+      </w:r>
+      <w:r>
+        <w:rPr>
+          <w:rFonts w:ascii="Times New Roman" w:hAnsi="Times New Roman"/>
+          <w:b w:val="0"/>
+          <w:i w:val="0"/>
+          <w:sz w:val="21"/>
+          <w:vertAlign w:val="subscript"/>
+        </w:rPr>
+        <w:t>2</w:t>
+      </w:r>
+      <w:r>
+        <w:rPr>
+          <w:rFonts w:ascii="Times New Roman" w:hAnsi="Times New Roman"/>
+          <w:b w:val="0"/>
+          <w:i w:val="0"/>
+          <w:sz w:val="21"/>
+        </w:rPr>
+        <w:t>NCH(CH</w:t>
+      </w:r>
+      <w:r>
+        <w:rPr>
+          <w:rFonts w:ascii="Times New Roman" w:hAnsi="Times New Roman"/>
+          <w:b w:val="0"/>
+          <w:i w:val="0"/>
+          <w:sz w:val="21"/>
+          <w:vertAlign w:val="subscript"/>
+        </w:rPr>
+        <w:t>3</w:t>
+      </w:r>
+      <w:r>
+        <w:rPr>
+          <w:rFonts w:ascii="Times New Roman" w:hAnsi="Times New Roman"/>
+          <w:b w:val="0"/>
+          <w:i w:val="0"/>
+          <w:sz w:val="21"/>
+        </w:rPr>
+        <w:t>)COOH.</w:t>
+      </w:r>
+    </w:p>
     <w:p>
       <w:pPr>
         <w:spacing w:before="60" w:after="40"/>
@@ -2237,98 +1950,61 @@
         <w:t xml:space="preserve"> Cho dãy các chất: tinh bột, cellulose, glucose, fructose, saccharose. Số chất trong dãy thuộc loại monosaccharide là</w:t>
       </w:r>
     </w:p>
-    <w:tbl>
-      <w:tblPr>
-        <w:tblW w:type="auto" w:w="0"/>
-        <w:jc w:val="center"/>
-        <w:tblLayout w:type="fixed"/>
-        <w:tblLook w:firstColumn="1" w:firstRow="1" w:lastColumn="0" w:lastRow="0" w:noHBand="0" w:noVBand="1" w:val="04A0"/>
-      </w:tblPr>
-      <w:tblGrid>
-        <w:gridCol w:w="2551"/>
-        <w:gridCol w:w="2551"/>
-        <w:gridCol w:w="2551"/>
-        <w:gridCol w:w="2551"/>
-      </w:tblGrid>
-      <w:tr>
-        <w:tc>
-          <w:tcPr>
-            <w:tcW w:type="dxa" w:w="2551"/>
-          </w:tcPr>
-          <w:p>
-            <w:pPr>
-              <w:spacing w:before="20" w:after="20"/>
-            </w:pPr>
-            <w:r>
-              <w:rPr>
-                <w:rFonts w:ascii="Times New Roman" w:hAnsi="Times New Roman"/>
-                <w:b w:val="0"/>
-                <w:i w:val="0"/>
-                <w:sz w:val="21"/>
-              </w:rPr>
-              <w:t>A. 1.</w:t>
-            </w:r>
-          </w:p>
-        </w:tc>
-        <w:tc>
-          <w:tcPr>
-            <w:tcW w:type="dxa" w:w="2551"/>
-          </w:tcPr>
-          <w:p>
-            <w:pPr>
-              <w:spacing w:before="20" w:after="20"/>
-            </w:pPr>
-            <w:r>
-              <w:rPr>
-                <w:rFonts w:ascii="Times New Roman" w:hAnsi="Times New Roman"/>
-                <w:b w:val="0"/>
-                <w:i w:val="0"/>
-                <w:sz w:val="21"/>
-              </w:rPr>
-              <w:t>B. 3.</w:t>
-            </w:r>
-          </w:p>
-        </w:tc>
-        <w:tc>
-          <w:tcPr>
-            <w:tcW w:type="dxa" w:w="2551"/>
-          </w:tcPr>
-          <w:p>
-            <w:pPr>
-              <w:spacing w:before="20" w:after="20"/>
-            </w:pPr>
-            <w:r>
-              <w:rPr>
-                <w:rFonts w:ascii="Times New Roman" w:hAnsi="Times New Roman"/>
-                <w:b w:val="0"/>
-                <w:i w:val="0"/>
-                <w:sz w:val="21"/>
-              </w:rPr>
-              <w:t>C. 2.</w:t>
-            </w:r>
-          </w:p>
-        </w:tc>
-        <w:tc>
-          <w:tcPr>
-            <w:tcW w:type="dxa" w:w="2551"/>
-          </w:tcPr>
-          <w:p>
-            <w:pPr>
-              <w:spacing w:before="20" w:after="20"/>
-            </w:pPr>
-            <w:r>
-              <w:rPr>
-                <w:rFonts w:ascii="Times New Roman" w:hAnsi="Times New Roman"/>
-                <w:b w:val="0"/>
-                <w:i w:val="0"/>
-                <w:sz w:val="21"/>
-              </w:rPr>
-              <w:t>D. 4.</w:t>
-            </w:r>
-          </w:p>
-        </w:tc>
-      </w:tr>
-    </w:tbl>
+    <w:p>
+      <w:pPr>
+        <w:tabs>
+          <w:tab w:pos="2551" w:val="left"/>
+          <w:tab w:pos="5102" w:val="left"/>
+          <w:tab w:pos="7654" w:val="left"/>
+        </w:tabs>
+        <w:spacing w:before="20" w:after="40"/>
+      </w:pPr>
+      <w:r>
+        <w:rPr>
+          <w:rFonts w:ascii="Times New Roman" w:hAnsi="Times New Roman"/>
+          <w:b w:val="0"/>
+          <w:i w:val="0"/>
+          <w:sz w:val="21"/>
+        </w:rPr>
+        <w:t>A. 1.</w:t>
+      </w:r>
+      <w:r>
+        <w:tab/>
+      </w:r>
+      <w:r>
+        <w:rPr>
+          <w:rFonts w:ascii="Times New Roman" w:hAnsi="Times New Roman"/>
+          <w:b w:val="0"/>
+          <w:i w:val="0"/>
+          <w:sz w:val="21"/>
+        </w:rPr>
+        <w:t>B. 3.</w:t>
+      </w:r>
+      <w:r>
+        <w:tab/>
+      </w:r>
+      <w:r>
+        <w:rPr>
+          <w:rFonts w:ascii="Times New Roman" w:hAnsi="Times New Roman"/>
+          <w:b w:val="0"/>
+          <w:i w:val="0"/>
+          <w:sz w:val="21"/>
+        </w:rPr>
+        <w:t>C. 2.</w:t>
+      </w:r>
+      <w:r>
+        <w:tab/>
+      </w:r>
+      <w:r>
+        <w:rPr>
+          <w:rFonts w:ascii="Times New Roman" w:hAnsi="Times New Roman"/>
+          <w:b w:val="0"/>
+          <w:i w:val="0"/>
+          <w:sz w:val="21"/>
+        </w:rPr>
+        <w:t>D. 4.</w:t>
+      </w:r>
+    </w:p>
     <w:p>
       <w:pPr>
         <w:spacing w:before="60" w:after="40"/>
@@ -2352,348 +2028,317 @@
         <w:t xml:space="preserve"> Chất nào sau đây là thành phần chính của chất giặt rửa tổng hợp?</w:t>
       </w:r>
     </w:p>
-    <w:tbl>
-      <w:tblPr>
-        <w:tblW w:type="auto" w:w="0"/>
-        <w:jc w:val="center"/>
-        <w:tblLayout w:type="fixed"/>
-        <w:tblLook w:firstColumn="1" w:firstRow="1" w:lastColumn="0" w:lastRow="0" w:noHBand="0" w:noVBand="1" w:val="04A0"/>
-      </w:tblPr>
-      <w:tblGrid>
-        <w:gridCol w:w="5103"/>
-        <w:gridCol w:w="5103"/>
-      </w:tblGrid>
-      <w:tr>
-        <w:tc>
-          <w:tcPr>
-            <w:tcW w:type="dxa" w:w="5102"/>
-          </w:tcPr>
-          <w:p>
-            <w:pPr>
-              <w:spacing w:before="20" w:after="20"/>
-            </w:pPr>
-            <w:r>
-              <w:rPr>
-                <w:rFonts w:ascii="Times New Roman" w:hAnsi="Times New Roman"/>
-                <w:b w:val="0"/>
-                <w:i w:val="0"/>
-                <w:sz w:val="21"/>
-              </w:rPr>
-              <w:t>A. (C</w:t>
-            </w:r>
-            <w:r>
-              <w:rPr>
-                <w:rFonts w:ascii="Times New Roman" w:hAnsi="Times New Roman"/>
-                <w:b w:val="0"/>
-                <w:i w:val="0"/>
-                <w:sz w:val="21"/>
-                <w:vertAlign w:val="subscript"/>
-              </w:rPr>
-              <w:t>17</w:t>
-            </w:r>
-            <w:r>
-              <w:rPr>
-                <w:rFonts w:ascii="Times New Roman" w:hAnsi="Times New Roman"/>
-                <w:b w:val="0"/>
-                <w:i w:val="0"/>
-                <w:sz w:val="21"/>
-              </w:rPr>
-              <w:t>H</w:t>
-            </w:r>
-            <w:r>
-              <w:rPr>
-                <w:rFonts w:ascii="Times New Roman" w:hAnsi="Times New Roman"/>
-                <w:b w:val="0"/>
-                <w:i w:val="0"/>
-                <w:sz w:val="21"/>
-                <w:vertAlign w:val="subscript"/>
-              </w:rPr>
-              <w:t>35</w:t>
-            </w:r>
-            <w:r>
-              <w:rPr>
-                <w:rFonts w:ascii="Times New Roman" w:hAnsi="Times New Roman"/>
-                <w:b w:val="0"/>
-                <w:i w:val="0"/>
-                <w:sz w:val="21"/>
-              </w:rPr>
-              <w:t>COO)</w:t>
-            </w:r>
-            <w:r>
-              <w:rPr>
-                <w:rFonts w:ascii="Times New Roman" w:hAnsi="Times New Roman"/>
-                <w:b w:val="0"/>
-                <w:i w:val="0"/>
-                <w:sz w:val="21"/>
-                <w:vertAlign w:val="subscript"/>
-              </w:rPr>
-              <w:t>2</w:t>
-            </w:r>
-            <w:r>
-              <w:rPr>
-                <w:rFonts w:ascii="Times New Roman" w:hAnsi="Times New Roman"/>
-                <w:b w:val="0"/>
-                <w:i w:val="0"/>
-                <w:sz w:val="21"/>
-              </w:rPr>
-              <w:t>Ca.</w:t>
-            </w:r>
-          </w:p>
-        </w:tc>
-        <w:tc>
-          <w:tcPr>
-            <w:tcW w:type="dxa" w:w="5102"/>
-          </w:tcPr>
-          <w:p>
-            <w:pPr>
-              <w:spacing w:before="20" w:after="20"/>
-            </w:pPr>
-            <w:r>
-              <w:rPr>
-                <w:rFonts w:ascii="Times New Roman" w:hAnsi="Times New Roman"/>
-                <w:b w:val="0"/>
-                <w:i w:val="0"/>
-                <w:sz w:val="21"/>
-              </w:rPr>
-              <w:t>B. C</w:t>
-            </w:r>
-            <w:r>
-              <w:rPr>
-                <w:rFonts w:ascii="Times New Roman" w:hAnsi="Times New Roman"/>
-                <w:b w:val="0"/>
-                <w:i w:val="0"/>
-                <w:sz w:val="21"/>
-                <w:vertAlign w:val="subscript"/>
-              </w:rPr>
-              <w:t>15</w:t>
-            </w:r>
-            <w:r>
-              <w:rPr>
-                <w:rFonts w:ascii="Times New Roman" w:hAnsi="Times New Roman"/>
-                <w:b w:val="0"/>
-                <w:i w:val="0"/>
-                <w:sz w:val="21"/>
-              </w:rPr>
-              <w:t>H</w:t>
-            </w:r>
-            <w:r>
-              <w:rPr>
-                <w:rFonts w:ascii="Times New Roman" w:hAnsi="Times New Roman"/>
-                <w:b w:val="0"/>
-                <w:i w:val="0"/>
-                <w:sz w:val="21"/>
-                <w:vertAlign w:val="subscript"/>
-              </w:rPr>
-              <w:t>31</w:t>
-            </w:r>
-            <w:r>
-              <w:rPr>
-                <w:rFonts w:ascii="Times New Roman" w:hAnsi="Times New Roman"/>
-                <w:b w:val="0"/>
-                <w:i w:val="0"/>
-                <w:sz w:val="21"/>
-              </w:rPr>
-              <w:t>COONa.</w:t>
-            </w:r>
-          </w:p>
-        </w:tc>
-      </w:tr>
-      <w:tr>
-        <w:tc>
-          <w:tcPr>
-            <w:tcW w:type="dxa" w:w="5102"/>
-          </w:tcPr>
-          <w:p>
-            <w:pPr>
-              <w:spacing w:before="20" w:after="20"/>
-            </w:pPr>
-            <w:r>
-              <w:rPr>
-                <w:rFonts w:ascii="Times New Roman" w:hAnsi="Times New Roman"/>
-                <w:b w:val="0"/>
-                <w:i w:val="0"/>
-                <w:sz w:val="21"/>
-              </w:rPr>
-              <w:t>C. C</w:t>
-            </w:r>
-            <w:r>
-              <w:rPr>
-                <w:rFonts w:ascii="Times New Roman" w:hAnsi="Times New Roman"/>
-                <w:b w:val="0"/>
-                <w:i w:val="0"/>
-                <w:sz w:val="21"/>
-                <w:vertAlign w:val="subscript"/>
-              </w:rPr>
-              <w:t>17</w:t>
-            </w:r>
-            <w:r>
-              <w:rPr>
-                <w:rFonts w:ascii="Times New Roman" w:hAnsi="Times New Roman"/>
-                <w:b w:val="0"/>
-                <w:i w:val="0"/>
-                <w:sz w:val="21"/>
-              </w:rPr>
-              <w:t>H</w:t>
-            </w:r>
-            <w:r>
-              <w:rPr>
-                <w:rFonts w:ascii="Times New Roman" w:hAnsi="Times New Roman"/>
-                <w:b w:val="0"/>
-                <w:i w:val="0"/>
-                <w:sz w:val="21"/>
-                <w:vertAlign w:val="subscript"/>
-              </w:rPr>
-              <w:t>35</w:t>
-            </w:r>
-            <w:r>
-              <w:rPr>
-                <w:rFonts w:ascii="Times New Roman" w:hAnsi="Times New Roman"/>
-                <w:b w:val="0"/>
-                <w:i w:val="0"/>
-                <w:sz w:val="21"/>
-              </w:rPr>
-              <w:t>COOK.</w:t>
-            </w:r>
-          </w:p>
-        </w:tc>
-        <w:tc>
-          <w:tcPr>
-            <w:tcW w:type="dxa" w:w="5102"/>
-          </w:tcPr>
-          <w:p>
-            <w:pPr>
-              <w:spacing w:before="20" w:after="20"/>
-            </w:pPr>
-            <w:r>
-              <w:rPr>
-                <w:rFonts w:ascii="Times New Roman" w:hAnsi="Times New Roman"/>
-                <w:b w:val="0"/>
-                <w:i w:val="0"/>
-                <w:sz w:val="21"/>
-              </w:rPr>
-              <w:t>D. CH</w:t>
-            </w:r>
-            <w:r>
-              <w:rPr>
-                <w:rFonts w:ascii="Times New Roman" w:hAnsi="Times New Roman"/>
-                <w:b w:val="0"/>
-                <w:i w:val="0"/>
-                <w:sz w:val="21"/>
-                <w:vertAlign w:val="subscript"/>
-              </w:rPr>
-              <w:t>3</w:t>
-            </w:r>
-            <w:r>
-              <w:rPr>
-                <w:rFonts w:ascii="Times New Roman" w:hAnsi="Times New Roman"/>
-                <w:b w:val="0"/>
-                <w:i w:val="0"/>
-                <w:sz w:val="21"/>
-              </w:rPr>
-              <w:t>[CH</w:t>
-            </w:r>
-            <w:r>
-              <w:rPr>
-                <w:rFonts w:ascii="Times New Roman" w:hAnsi="Times New Roman"/>
-                <w:b w:val="0"/>
-                <w:i w:val="0"/>
-                <w:sz w:val="21"/>
-                <w:vertAlign w:val="subscript"/>
-              </w:rPr>
-              <w:t>2</w:t>
-            </w:r>
-            <w:r>
-              <w:rPr>
-                <w:rFonts w:ascii="Times New Roman" w:hAnsi="Times New Roman"/>
-                <w:b w:val="0"/>
-                <w:i w:val="0"/>
-                <w:sz w:val="21"/>
-              </w:rPr>
-              <w:t>]</w:t>
-            </w:r>
-            <w:r>
-              <w:rPr>
-                <w:rFonts w:ascii="Times New Roman" w:hAnsi="Times New Roman"/>
-                <w:b w:val="0"/>
-                <w:i w:val="0"/>
-                <w:sz w:val="21"/>
-                <w:vertAlign w:val="subscript"/>
-              </w:rPr>
-              <w:t>11</w:t>
-            </w:r>
-            <w:r>
-              <w:rPr>
-                <w:rFonts w:ascii="Times New Roman" w:hAnsi="Times New Roman"/>
-                <w:b w:val="0"/>
-                <w:i w:val="0"/>
-                <w:sz w:val="21"/>
-              </w:rPr>
-              <w:t>-C</w:t>
-            </w:r>
-            <w:r>
-              <w:rPr>
-                <w:rFonts w:ascii="Times New Roman" w:hAnsi="Times New Roman"/>
-                <w:b w:val="0"/>
-                <w:i w:val="0"/>
-                <w:sz w:val="21"/>
-                <w:vertAlign w:val="subscript"/>
-              </w:rPr>
-              <w:t>6</w:t>
-            </w:r>
-            <w:r>
-              <w:rPr>
-                <w:rFonts w:ascii="Times New Roman" w:hAnsi="Times New Roman"/>
-                <w:b w:val="0"/>
-                <w:i w:val="0"/>
-                <w:sz w:val="21"/>
-              </w:rPr>
-              <w:t>H</w:t>
-            </w:r>
-            <w:r>
-              <w:rPr>
-                <w:rFonts w:ascii="Times New Roman" w:hAnsi="Times New Roman"/>
-                <w:b w:val="0"/>
-                <w:i w:val="0"/>
-                <w:sz w:val="21"/>
-                <w:vertAlign w:val="subscript"/>
-              </w:rPr>
-              <w:t>4</w:t>
-            </w:r>
-            <w:r>
-              <w:rPr>
-                <w:rFonts w:ascii="Times New Roman" w:hAnsi="Times New Roman"/>
-                <w:b w:val="0"/>
-                <w:i w:val="0"/>
-                <w:sz w:val="21"/>
-              </w:rPr>
-              <w:t>-SO</w:t>
-            </w:r>
-            <w:r>
-              <w:rPr>
-                <w:rFonts w:ascii="Times New Roman" w:hAnsi="Times New Roman"/>
-                <w:b w:val="0"/>
-                <w:i w:val="0"/>
-                <w:sz w:val="21"/>
-                <w:vertAlign w:val="subscript"/>
-              </w:rPr>
-              <w:t>3</w:t>
-            </w:r>
-            <w:r>
-              <w:rPr>
-                <w:rFonts w:ascii="Times New Roman" w:hAnsi="Times New Roman"/>
-                <w:b w:val="0"/>
-                <w:i w:val="0"/>
-                <w:sz w:val="21"/>
-              </w:rPr>
-              <w:t>Na (hình bên dưới)</w:t>
-            </w:r>
-          </w:p>
-        </w:tc>
-      </w:tr>
-    </w:tbl>
+    <w:p>
+      <w:pPr>
+        <w:spacing w:before="20" w:after="20"/>
+        <w:ind w:left="283"/>
+      </w:pPr>
+      <w:r>
+        <w:rPr>
+          <w:rFonts w:ascii="Times New Roman" w:hAnsi="Times New Roman"/>
+          <w:b w:val="0"/>
+          <w:i w:val="0"/>
+          <w:sz w:val="21"/>
+        </w:rPr>
+        <w:t>A. (C</w:t>
+      </w:r>
+      <w:r>
+        <w:rPr>
+          <w:rFonts w:ascii="Times New Roman" w:hAnsi="Times New Roman"/>
+          <w:b w:val="0"/>
+          <w:i w:val="0"/>
+          <w:sz w:val="21"/>
+          <w:vertAlign w:val="subscript"/>
+        </w:rPr>
+        <w:t>17</w:t>
+      </w:r>
+      <w:r>
+        <w:rPr>
+          <w:rFonts w:ascii="Times New Roman" w:hAnsi="Times New Roman"/>
+          <w:b w:val="0"/>
+          <w:i w:val="0"/>
+          <w:sz w:val="21"/>
+        </w:rPr>
+        <w:t>H</w:t>
+      </w:r>
+      <w:r>
+        <w:rPr>
+          <w:rFonts w:ascii="Times New Roman" w:hAnsi="Times New Roman"/>
+          <w:b w:val="0"/>
+          <w:i w:val="0"/>
+          <w:sz w:val="21"/>
+          <w:vertAlign w:val="subscript"/>
+        </w:rPr>
+        <w:t>35</w:t>
+      </w:r>
+      <w:r>
+        <w:rPr>
+          <w:rFonts w:ascii="Times New Roman" w:hAnsi="Times New Roman"/>
+          <w:b w:val="0"/>
+          <w:i w:val="0"/>
+          <w:sz w:val="21"/>
+        </w:rPr>
+        <w:t>COO)</w:t>
+      </w:r>
+      <w:r>
+        <w:rPr>
+          <w:rFonts w:ascii="Times New Roman" w:hAnsi="Times New Roman"/>
+          <w:b w:val="0"/>
+          <w:i w:val="0"/>
+          <w:sz w:val="21"/>
+          <w:vertAlign w:val="subscript"/>
+        </w:rPr>
+        <w:t>2</w:t>
+      </w:r>
+      <w:r>
+        <w:rPr>
+          <w:rFonts w:ascii="Times New Roman" w:hAnsi="Times New Roman"/>
+          <w:b w:val="0"/>
+          <w:i w:val="0"/>
+          <w:sz w:val="21"/>
+        </w:rPr>
+        <w:t>Ca.</w:t>
+      </w:r>
+    </w:p>
+    <w:p>
+      <w:pPr>
+        <w:spacing w:before="20" w:after="20"/>
+        <w:ind w:left="283"/>
+      </w:pPr>
+      <w:r>
+        <w:rPr>
+          <w:rFonts w:ascii="Times New Roman" w:hAnsi="Times New Roman"/>
+          <w:b w:val="0"/>
+          <w:i w:val="0"/>
+          <w:sz w:val="21"/>
+        </w:rPr>
+        <w:t>B. C</w:t>
+      </w:r>
+      <w:r>
+        <w:rPr>
+          <w:rFonts w:ascii="Times New Roman" w:hAnsi="Times New Roman"/>
+          <w:b w:val="0"/>
+          <w:i w:val="0"/>
+          <w:sz w:val="21"/>
+          <w:vertAlign w:val="subscript"/>
+        </w:rPr>
+        <w:t>15</w:t>
+      </w:r>
+      <w:r>
+        <w:rPr>
+          <w:rFonts w:ascii="Times New Roman" w:hAnsi="Times New Roman"/>
+          <w:b w:val="0"/>
+          <w:i w:val="0"/>
+          <w:sz w:val="21"/>
+        </w:rPr>
+        <w:t>H</w:t>
+      </w:r>
+      <w:r>
+        <w:rPr>
+          <w:rFonts w:ascii="Times New Roman" w:hAnsi="Times New Roman"/>
+          <w:b w:val="0"/>
+          <w:i w:val="0"/>
+          <w:sz w:val="21"/>
+          <w:vertAlign w:val="subscript"/>
+        </w:rPr>
+        <w:t>31</w:t>
+      </w:r>
+      <w:r>
+        <w:rPr>
+          <w:rFonts w:ascii="Times New Roman" w:hAnsi="Times New Roman"/>
+          <w:b w:val="0"/>
+          <w:i w:val="0"/>
+          <w:sz w:val="21"/>
+        </w:rPr>
+        <w:t>COONa.</w:t>
+      </w:r>
+    </w:p>
+    <w:p>
+      <w:pPr>
+        <w:spacing w:before="20" w:after="20"/>
+        <w:ind w:left="283"/>
+      </w:pPr>
+      <w:r>
+        <w:rPr>
+          <w:rFonts w:ascii="Times New Roman" w:hAnsi="Times New Roman"/>
+          <w:b w:val="0"/>
+          <w:i w:val="0"/>
+          <w:sz w:val="21"/>
+        </w:rPr>
+        <w:t>C. C</w:t>
+      </w:r>
+      <w:r>
+        <w:rPr>
+          <w:rFonts w:ascii="Times New Roman" w:hAnsi="Times New Roman"/>
+          <w:b w:val="0"/>
+          <w:i w:val="0"/>
+          <w:sz w:val="21"/>
+          <w:vertAlign w:val="subscript"/>
+        </w:rPr>
+        <w:t>17</w:t>
+      </w:r>
+      <w:r>
+        <w:rPr>
+          <w:rFonts w:ascii="Times New Roman" w:hAnsi="Times New Roman"/>
+          <w:b w:val="0"/>
+          <w:i w:val="0"/>
+          <w:sz w:val="21"/>
+        </w:rPr>
+        <w:t>H</w:t>
+      </w:r>
+      <w:r>
+        <w:rPr>
+          <w:rFonts w:ascii="Times New Roman" w:hAnsi="Times New Roman"/>
+          <w:b w:val="0"/>
+          <w:i w:val="0"/>
+          <w:sz w:val="21"/>
+          <w:vertAlign w:val="subscript"/>
+        </w:rPr>
+        <w:t>35</w:t>
+      </w:r>
+      <w:r>
+        <w:rPr>
+          <w:rFonts w:ascii="Times New Roman" w:hAnsi="Times New Roman"/>
+          <w:b w:val="0"/>
+          <w:i w:val="0"/>
+          <w:sz w:val="21"/>
+        </w:rPr>
+        <w:t>COOK.</w:t>
+      </w:r>
+    </w:p>
+    <w:p>
+      <w:pPr>
+        <w:spacing w:before="20" w:after="20"/>
+        <w:ind w:left="283"/>
+      </w:pPr>
+      <w:r>
+        <w:rPr>
+          <w:rFonts w:ascii="Times New Roman" w:hAnsi="Times New Roman"/>
+          <w:b w:val="0"/>
+          <w:i w:val="0"/>
+          <w:sz w:val="21"/>
+        </w:rPr>
+        <w:t>D. CH</w:t>
+      </w:r>
+      <w:r>
+        <w:rPr>
+          <w:rFonts w:ascii="Times New Roman" w:hAnsi="Times New Roman"/>
+          <w:b w:val="0"/>
+          <w:i w:val="0"/>
+          <w:sz w:val="21"/>
+          <w:vertAlign w:val="subscript"/>
+        </w:rPr>
+        <w:t>3</w:t>
+      </w:r>
+      <w:r>
+        <w:rPr>
+          <w:rFonts w:ascii="Times New Roman" w:hAnsi="Times New Roman"/>
+          <w:b w:val="0"/>
+          <w:i w:val="0"/>
+          <w:sz w:val="21"/>
+        </w:rPr>
+        <w:t>[CH</w:t>
+      </w:r>
+      <w:r>
+        <w:rPr>
+          <w:rFonts w:ascii="Times New Roman" w:hAnsi="Times New Roman"/>
+          <w:b w:val="0"/>
+          <w:i w:val="0"/>
+          <w:sz w:val="21"/>
+          <w:vertAlign w:val="subscript"/>
+        </w:rPr>
+        <w:t>2</w:t>
+      </w:r>
+      <w:r>
+        <w:rPr>
+          <w:rFonts w:ascii="Times New Roman" w:hAnsi="Times New Roman"/>
+          <w:b w:val="0"/>
+          <w:i w:val="0"/>
+          <w:sz w:val="21"/>
+        </w:rPr>
+        <w:t>]</w:t>
+      </w:r>
+      <w:r>
+        <w:rPr>
+          <w:rFonts w:ascii="Times New Roman" w:hAnsi="Times New Roman"/>
+          <w:b w:val="0"/>
+          <w:i w:val="0"/>
+          <w:sz w:val="21"/>
+          <w:vertAlign w:val="subscript"/>
+        </w:rPr>
+        <w:t>11</w:t>
+      </w:r>
+      <w:r>
+        <w:rPr>
+          <w:rFonts w:ascii="Times New Roman" w:hAnsi="Times New Roman"/>
+          <w:b w:val="0"/>
+          <w:i w:val="0"/>
+          <w:sz w:val="21"/>
+        </w:rPr>
+        <w:t>-C</w:t>
+      </w:r>
+      <w:r>
+        <w:rPr>
+          <w:rFonts w:ascii="Times New Roman" w:hAnsi="Times New Roman"/>
+          <w:b w:val="0"/>
+          <w:i w:val="0"/>
+          <w:sz w:val="21"/>
+          <w:vertAlign w:val="subscript"/>
+        </w:rPr>
+        <w:t>6</w:t>
+      </w:r>
+      <w:r>
+        <w:rPr>
+          <w:rFonts w:ascii="Times New Roman" w:hAnsi="Times New Roman"/>
+          <w:b w:val="0"/>
+          <w:i w:val="0"/>
+          <w:sz w:val="21"/>
+        </w:rPr>
+        <w:t>H</w:t>
+      </w:r>
+      <w:r>
+        <w:rPr>
+          <w:rFonts w:ascii="Times New Roman" w:hAnsi="Times New Roman"/>
+          <w:b w:val="0"/>
+          <w:i w:val="0"/>
+          <w:sz w:val="21"/>
+          <w:vertAlign w:val="subscript"/>
+        </w:rPr>
+        <w:t>4</w:t>
+      </w:r>
+      <w:r>
+        <w:rPr>
+          <w:rFonts w:ascii="Times New Roman" w:hAnsi="Times New Roman"/>
+          <w:b w:val="0"/>
+          <w:i w:val="0"/>
+          <w:sz w:val="21"/>
+        </w:rPr>
+        <w:t>-SO</w:t>
+      </w:r>
+      <w:r>
+        <w:rPr>
+          <w:rFonts w:ascii="Times New Roman" w:hAnsi="Times New Roman"/>
+          <w:b w:val="0"/>
+          <w:i w:val="0"/>
+          <w:sz w:val="21"/>
+          <w:vertAlign w:val="subscript"/>
+        </w:rPr>
+        <w:t>3</w:t>
+      </w:r>
+      <w:r>
+        <w:rPr>
+          <w:rFonts w:ascii="Times New Roman" w:hAnsi="Times New Roman"/>
+          <w:b w:val="0"/>
+          <w:i w:val="0"/>
+          <w:sz w:val="21"/>
+        </w:rPr>
+        <w:t>Na (hình bên dưới)</w:t>
+      </w:r>
+    </w:p>
     <w:p>
       <w:pPr>
         <w:spacing w:before="20" w:after="40"/>
+        <w:ind w:left="283"/>
       </w:pPr>
       <w:r>
         <w:t xml:space="preserve">   Công thức D: </w:t>
@@ -3117,98 +2762,61 @@
         <w:t xml:space="preserve"> (aniline) là:</w:t>
       </w:r>
     </w:p>
-    <w:tbl>
-      <w:tblPr>
-        <w:tblW w:type="auto" w:w="0"/>
-        <w:jc w:val="center"/>
-        <w:tblLayout w:type="fixed"/>
-        <w:tblLook w:firstColumn="1" w:firstRow="1" w:lastColumn="0" w:lastRow="0" w:noHBand="0" w:noVBand="1" w:val="04A0"/>
-      </w:tblPr>
-      <w:tblGrid>
-        <w:gridCol w:w="2551"/>
-        <w:gridCol w:w="2551"/>
-        <w:gridCol w:w="2551"/>
-        <w:gridCol w:w="2551"/>
-      </w:tblGrid>
-      <w:tr>
-        <w:tc>
-          <w:tcPr>
-            <w:tcW w:type="dxa" w:w="2551"/>
-          </w:tcPr>
-          <w:p>
-            <w:pPr>
-              <w:spacing w:before="20" w:after="20"/>
-            </w:pPr>
-            <w:r>
-              <w:rPr>
-                <w:rFonts w:ascii="Times New Roman" w:hAnsi="Times New Roman"/>
-                <w:b w:val="0"/>
-                <w:i w:val="0"/>
-                <w:sz w:val="21"/>
-              </w:rPr>
-              <w:t>A. 6.</w:t>
-            </w:r>
-          </w:p>
-        </w:tc>
-        <w:tc>
-          <w:tcPr>
-            <w:tcW w:type="dxa" w:w="2551"/>
-          </w:tcPr>
-          <w:p>
-            <w:pPr>
-              <w:spacing w:before="20" w:after="20"/>
-            </w:pPr>
-            <w:r>
-              <w:rPr>
-                <w:rFonts w:ascii="Times New Roman" w:hAnsi="Times New Roman"/>
-                <w:b w:val="0"/>
-                <w:i w:val="0"/>
-                <w:sz w:val="21"/>
-              </w:rPr>
-              <w:t>B. 7.</w:t>
-            </w:r>
-          </w:p>
-        </w:tc>
-        <w:tc>
-          <w:tcPr>
-            <w:tcW w:type="dxa" w:w="2551"/>
-          </w:tcPr>
-          <w:p>
-            <w:pPr>
-              <w:spacing w:before="20" w:after="20"/>
-            </w:pPr>
-            <w:r>
-              <w:rPr>
-                <w:rFonts w:ascii="Times New Roman" w:hAnsi="Times New Roman"/>
-                <w:b w:val="0"/>
-                <w:i w:val="0"/>
-                <w:sz w:val="21"/>
-              </w:rPr>
-              <w:t>C. 5.</w:t>
-            </w:r>
-          </w:p>
-        </w:tc>
-        <w:tc>
-          <w:tcPr>
-            <w:tcW w:type="dxa" w:w="2551"/>
-          </w:tcPr>
-          <w:p>
-            <w:pPr>
-              <w:spacing w:before="20" w:after="20"/>
-            </w:pPr>
-            <w:r>
-              <w:rPr>
-                <w:rFonts w:ascii="Times New Roman" w:hAnsi="Times New Roman"/>
-                <w:b w:val="0"/>
-                <w:i w:val="0"/>
-                <w:sz w:val="21"/>
-              </w:rPr>
-              <w:t>D. 4.</w:t>
-            </w:r>
-          </w:p>
-        </w:tc>
-      </w:tr>
-    </w:tbl>
+    <w:p>
+      <w:pPr>
+        <w:tabs>
+          <w:tab w:pos="2551" w:val="left"/>
+          <w:tab w:pos="5102" w:val="left"/>
+          <w:tab w:pos="7654" w:val="left"/>
+        </w:tabs>
+        <w:spacing w:before="20" w:after="40"/>
+      </w:pPr>
+      <w:r>
+        <w:rPr>
+          <w:rFonts w:ascii="Times New Roman" w:hAnsi="Times New Roman"/>
+          <w:b w:val="0"/>
+          <w:i w:val="0"/>
+          <w:sz w:val="21"/>
+        </w:rPr>
+        <w:t>A. 6.</w:t>
+      </w:r>
+      <w:r>
+        <w:tab/>
+      </w:r>
+      <w:r>
+        <w:rPr>
+          <w:rFonts w:ascii="Times New Roman" w:hAnsi="Times New Roman"/>
+          <w:b w:val="0"/>
+          <w:i w:val="0"/>
+          <w:sz w:val="21"/>
+        </w:rPr>
+        <w:t>B. 7.</w:t>
+      </w:r>
+      <w:r>
+        <w:tab/>
+      </w:r>
+      <w:r>
+        <w:rPr>
+          <w:rFonts w:ascii="Times New Roman" w:hAnsi="Times New Roman"/>
+          <w:b w:val="0"/>
+          <w:i w:val="0"/>
+          <w:sz w:val="21"/>
+        </w:rPr>
+        <w:t>C. 5.</w:t>
+      </w:r>
+      <w:r>
+        <w:tab/>
+      </w:r>
+      <w:r>
+        <w:rPr>
+          <w:rFonts w:ascii="Times New Roman" w:hAnsi="Times New Roman"/>
+          <w:b w:val="0"/>
+          <w:i w:val="0"/>
+          <w:sz w:val="21"/>
+        </w:rPr>
+        <w:t>D. 4.</w:t>
+      </w:r>
+    </w:p>
     <w:p>
       <w:pPr>
         <w:spacing w:before="120" w:after="40"/>
@@ -3321,222 +2929,142 @@
         <w:t xml:space="preserve"> Để nguội, rồi rót hỗn hợp sản phẩm vào ống nghiệm chứa 2 mL dung dịch NaCl bão hòa.</w:t>
       </w:r>
     </w:p>
-    <w:tbl>
-      <w:tblPr>
-        <w:tblW w:type="auto" w:w="0"/>
-        <w:jc w:val="center"/>
-        <w:tblLayout w:type="fixed"/>
-        <w:tblLook w:firstColumn="1" w:firstRow="1" w:lastColumn="0" w:lastRow="0" w:noHBand="0" w:noVBand="1" w:val="04A0"/>
-      </w:tblPr>
-      <w:tblGrid>
-        <w:gridCol w:w="5103"/>
-        <w:gridCol w:w="5103"/>
-      </w:tblGrid>
-      <w:tr>
-        <w:tc>
-          <w:tcPr>
-            <w:tcW w:type="dxa" w:w="8787"/>
-          </w:tcPr>
-          <w:p>
-            <w:pPr>
-              <w:spacing w:before="20" w:after="20"/>
-            </w:pPr>
-            <w:r>
-              <w:rPr>
-                <w:rFonts w:ascii="Times New Roman" w:hAnsi="Times New Roman"/>
-                <w:b/>
-                <w:i w:val="0"/>
-                <w:sz w:val="21"/>
-              </w:rPr>
-              <w:t>a)</w:t>
-            </w:r>
-            <w:r>
-              <w:rPr>
-                <w:rFonts w:ascii="Times New Roman" w:hAnsi="Times New Roman"/>
-                <w:b w:val="0"/>
-                <w:i w:val="0"/>
-                <w:sz w:val="21"/>
-              </w:rPr>
-              <w:t xml:space="preserve"> Tách isoamyl acetate từ hỗn hợp sau bước 3 bằng phương pháp chiết.</w:t>
-            </w:r>
-          </w:p>
-        </w:tc>
-        <w:tc>
-          <w:tcPr>
-            <w:tcW w:type="dxa" w:w="1417"/>
-          </w:tcPr>
-          <w:p>
-            <w:pPr>
-              <w:spacing w:before="20" w:after="20"/>
-              <w:jc w:val="center"/>
-            </w:pPr>
-            <w:r>
-              <w:rPr>
-                <w:rFonts w:ascii="Times New Roman" w:hAnsi="Times New Roman"/>
-                <w:b w:val="0"/>
-                <w:i w:val="0"/>
-                <w:color w:val="616161"/>
-                <w:sz w:val="20"/>
-              </w:rPr>
-              <w:t>[ Đúng / Sai ]</w:t>
-            </w:r>
-          </w:p>
-        </w:tc>
-      </w:tr>
-      <w:tr>
-        <w:tc>
-          <w:tcPr>
-            <w:tcW w:type="dxa" w:w="8787"/>
-          </w:tcPr>
-          <w:p>
-            <w:pPr>
-              <w:spacing w:before="20" w:after="20"/>
-            </w:pPr>
-            <w:r>
-              <w:rPr>
-                <w:rFonts w:ascii="Times New Roman" w:hAnsi="Times New Roman"/>
-                <w:b/>
-                <w:i w:val="0"/>
-                <w:sz w:val="21"/>
-              </w:rPr>
-              <w:t>b)</w:t>
-            </w:r>
-            <w:r>
-              <w:rPr>
-                <w:rFonts w:ascii="Times New Roman" w:hAnsi="Times New Roman"/>
-                <w:b w:val="0"/>
-                <w:i w:val="0"/>
-                <w:sz w:val="21"/>
-              </w:rPr>
-              <w:t xml:space="preserve"> Mục đích chính của việc cho dung dịch NaCl bão hòa nhằm tránh sự phân hủy sản phẩm.</w:t>
-            </w:r>
-          </w:p>
-        </w:tc>
-        <w:tc>
-          <w:tcPr>
-            <w:tcW w:type="dxa" w:w="1417"/>
-          </w:tcPr>
-          <w:p>
-            <w:pPr>
-              <w:spacing w:before="20" w:after="20"/>
-              <w:jc w:val="center"/>
-            </w:pPr>
-            <w:r>
-              <w:rPr>
-                <w:rFonts w:ascii="Times New Roman" w:hAnsi="Times New Roman"/>
-                <w:b w:val="0"/>
-                <w:i w:val="0"/>
-                <w:color w:val="616161"/>
-                <w:sz w:val="20"/>
-              </w:rPr>
-              <w:t>[ Đúng / Sai ]</w:t>
-            </w:r>
-          </w:p>
-        </w:tc>
-      </w:tr>
-      <w:tr>
-        <w:tc>
-          <w:tcPr>
-            <w:tcW w:type="dxa" w:w="8787"/>
-          </w:tcPr>
-          <w:p>
-            <w:pPr>
-              <w:spacing w:before="20" w:after="20"/>
-            </w:pPr>
-            <w:r>
-              <w:rPr>
-                <w:rFonts w:ascii="Times New Roman" w:hAnsi="Times New Roman"/>
-                <w:b/>
-                <w:i w:val="0"/>
-                <w:sz w:val="21"/>
-              </w:rPr>
-              <w:t>c)</w:t>
-            </w:r>
-            <w:r>
-              <w:rPr>
-                <w:rFonts w:ascii="Times New Roman" w:hAnsi="Times New Roman"/>
-                <w:b w:val="0"/>
-                <w:i w:val="0"/>
-                <w:sz w:val="21"/>
-              </w:rPr>
-              <w:t xml:space="preserve"> Ở bước 2 xảy ra phản ứng ester hóa, giải phóng hơi có mùi thơm của chuối chín.</w:t>
-            </w:r>
-          </w:p>
-        </w:tc>
-        <w:tc>
-          <w:tcPr>
-            <w:tcW w:type="dxa" w:w="1417"/>
-          </w:tcPr>
-          <w:p>
-            <w:pPr>
-              <w:spacing w:before="20" w:after="20"/>
-              <w:jc w:val="center"/>
-            </w:pPr>
-            <w:r>
-              <w:rPr>
-                <w:rFonts w:ascii="Times New Roman" w:hAnsi="Times New Roman"/>
-                <w:b w:val="0"/>
-                <w:i w:val="0"/>
-                <w:color w:val="616161"/>
-                <w:sz w:val="20"/>
-              </w:rPr>
-              <w:t>[ Đúng / Sai ]</w:t>
-            </w:r>
-          </w:p>
-        </w:tc>
-      </w:tr>
-      <w:tr>
-        <w:tc>
-          <w:tcPr>
-            <w:tcW w:type="dxa" w:w="8787"/>
-          </w:tcPr>
-          <w:p>
-            <w:pPr>
-              <w:spacing w:before="20" w:after="20"/>
-            </w:pPr>
-            <w:r>
-              <w:rPr>
-                <w:rFonts w:ascii="Times New Roman" w:hAnsi="Times New Roman"/>
-                <w:b/>
-                <w:i w:val="0"/>
-                <w:sz w:val="21"/>
-              </w:rPr>
-              <w:t>d)</w:t>
-            </w:r>
-            <w:r>
-              <w:rPr>
-                <w:rFonts w:ascii="Times New Roman" w:hAnsi="Times New Roman"/>
-                <w:b w:val="0"/>
-                <w:i w:val="0"/>
-                <w:sz w:val="21"/>
-              </w:rPr>
-              <w:t xml:space="preserve"> Phản ứng ester hóa giữa isoamyl alcohol với acetic acid là phản ứng thuận nghịch.</w:t>
-            </w:r>
-          </w:p>
-        </w:tc>
-        <w:tc>
-          <w:tcPr>
-            <w:tcW w:type="dxa" w:w="1417"/>
-          </w:tcPr>
-          <w:p>
-            <w:pPr>
-              <w:spacing w:before="20" w:after="20"/>
-              <w:jc w:val="center"/>
-            </w:pPr>
-            <w:r>
-              <w:rPr>
-                <w:rFonts w:ascii="Times New Roman" w:hAnsi="Times New Roman"/>
-                <w:b w:val="0"/>
-                <w:i w:val="0"/>
-                <w:color w:val="616161"/>
-                <w:sz w:val="20"/>
-              </w:rPr>
-              <w:t>[ Đúng / Sai ]</w:t>
-            </w:r>
-          </w:p>
-        </w:tc>
-      </w:tr>
-    </w:tbl>
+    <w:p>
+      <w:pPr>
+        <w:spacing w:before="20" w:after="20"/>
+        <w:ind w:left="283"/>
+      </w:pPr>
+      <w:r>
+        <w:rPr>
+          <w:rFonts w:ascii="Times New Roman" w:hAnsi="Times New Roman"/>
+          <w:b/>
+          <w:i w:val="0"/>
+          <w:sz w:val="21"/>
+        </w:rPr>
+        <w:t>a)</w:t>
+      </w:r>
+      <w:r>
+        <w:rPr>
+          <w:rFonts w:ascii="Times New Roman" w:hAnsi="Times New Roman"/>
+          <w:b w:val="0"/>
+          <w:i w:val="0"/>
+          <w:sz w:val="21"/>
+        </w:rPr>
+        <w:t xml:space="preserve"> Tách isoamyl acetate từ hỗn hợp sau bước 3 bằng phương pháp chiết.</w:t>
+      </w:r>
+      <w:r>
+        <w:rPr>
+          <w:rFonts w:ascii="Times New Roman" w:hAnsi="Times New Roman"/>
+          <w:b w:val="0"/>
+          <w:i/>
+          <w:color w:val="616161"/>
+          <w:sz w:val="20"/>
+        </w:rPr>
+        <w:t xml:space="preserve">   [ Đúng / Sai ]</w:t>
+      </w:r>
+    </w:p>
+    <w:p>
+      <w:pPr>
+        <w:spacing w:before="20" w:after="20"/>
+        <w:ind w:left="283"/>
+      </w:pPr>
+      <w:r>
+        <w:rPr>
+          <w:rFonts w:ascii="Times New Roman" w:hAnsi="Times New Roman"/>
+          <w:b/>
+          <w:i w:val="0"/>
+          <w:sz w:val="21"/>
+        </w:rPr>
+        <w:t>b)</w:t>
+      </w:r>
+      <w:r>
+        <w:rPr>
+          <w:rFonts w:ascii="Times New Roman" w:hAnsi="Times New Roman"/>
+          <w:b w:val="0"/>
+          <w:i w:val="0"/>
+          <w:sz w:val="21"/>
+        </w:rPr>
+        <w:t xml:space="preserve"> Mục đích chính của việc cho dung dịch NaCl bão hòa nhằm tránh sự phân hủy sản phẩm.</w:t>
+      </w:r>
+      <w:r>
+        <w:rPr>
+          <w:rFonts w:ascii="Times New Roman" w:hAnsi="Times New Roman"/>
+          <w:b w:val="0"/>
+          <w:i/>
+          <w:color w:val="616161"/>
+          <w:sz w:val="20"/>
+        </w:rPr>
+        <w:t xml:space="preserve">   [ Đúng / Sai ]</w:t>
+      </w:r>
+    </w:p>
+    <w:p>
+      <w:pPr>
+        <w:spacing w:before="20" w:after="20"/>
+        <w:ind w:left="283"/>
+      </w:pPr>
+      <w:r>
+        <w:rPr>
+          <w:rFonts w:ascii="Times New Roman" w:hAnsi="Times New Roman"/>
+          <w:b/>
+          <w:i w:val="0"/>
+          <w:sz w:val="21"/>
+        </w:rPr>
+        <w:t>c)</w:t>
+      </w:r>
+      <w:r>
+        <w:rPr>
+          <w:rFonts w:ascii="Times New Roman" w:hAnsi="Times New Roman"/>
+          <w:b w:val="0"/>
+          <w:i w:val="0"/>
+          <w:sz w:val="21"/>
+        </w:rPr>
+        <w:t xml:space="preserve"> Ở bước 2 xảy ra phản ứng ester hóa, giải phóng hơi có mùi thơm của chuối chín.</w:t>
+      </w:r>
+      <w:r>
+        <w:rPr>
+          <w:rFonts w:ascii="Times New Roman" w:hAnsi="Times New Roman"/>
+          <w:b w:val="0"/>
+          <w:i/>
+          <w:color w:val="616161"/>
+          <w:sz w:val="20"/>
+        </w:rPr>
+        <w:t xml:space="preserve">   [ Đúng / Sai ]</w:t>
+      </w:r>
+    </w:p>
+    <w:p>
+      <w:pPr>
+        <w:spacing w:before="20" w:after="20"/>
+        <w:ind w:left="283"/>
+      </w:pPr>
+      <w:r>
+        <w:rPr>
+          <w:rFonts w:ascii="Times New Roman" w:hAnsi="Times New Roman"/>
+          <w:b/>
+          <w:i w:val="0"/>
+          <w:sz w:val="21"/>
+        </w:rPr>
+        <w:t>d)</w:t>
+      </w:r>
+      <w:r>
+        <w:rPr>
+          <w:rFonts w:ascii="Times New Roman" w:hAnsi="Times New Roman"/>
+          <w:b w:val="0"/>
+          <w:i w:val="0"/>
+          <w:sz w:val="21"/>
+        </w:rPr>
+        <w:t xml:space="preserve"> Phản ứng ester hóa giữa isoamyl alcohol với acetic acid là phản ứng thuận nghịch.</w:t>
+      </w:r>
+      <w:r>
+        <w:rPr>
+          <w:rFonts w:ascii="Times New Roman" w:hAnsi="Times New Roman"/>
+          <w:b w:val="0"/>
+          <w:i/>
+          <w:color w:val="616161"/>
+          <w:sz w:val="20"/>
+        </w:rPr>
+        <w:t xml:space="preserve">   [ Đúng / Sai ]</w:t>
+      </w:r>
+    </w:p>
     <w:p>
       <w:pPr>
         <w:spacing w:before="80" w:after="40"/>
@@ -3560,222 +3088,142 @@
         <w:t xml:space="preserve"> Em hãy cho biết các phát biểu sau đúng hay sai?</w:t>
       </w:r>
     </w:p>
-    <w:tbl>
-      <w:tblPr>
-        <w:tblW w:type="auto" w:w="0"/>
-        <w:jc w:val="center"/>
-        <w:tblLayout w:type="fixed"/>
-        <w:tblLook w:firstColumn="1" w:firstRow="1" w:lastColumn="0" w:lastRow="0" w:noHBand="0" w:noVBand="1" w:val="04A0"/>
-      </w:tblPr>
-      <w:tblGrid>
-        <w:gridCol w:w="5103"/>
-        <w:gridCol w:w="5103"/>
-      </w:tblGrid>
-      <w:tr>
-        <w:tc>
-          <w:tcPr>
-            <w:tcW w:type="dxa" w:w="8787"/>
-          </w:tcPr>
-          <w:p>
-            <w:pPr>
-              <w:spacing w:before="20" w:after="20"/>
-            </w:pPr>
-            <w:r>
-              <w:rPr>
-                <w:rFonts w:ascii="Times New Roman" w:hAnsi="Times New Roman"/>
-                <w:b/>
-                <w:i w:val="0"/>
-                <w:sz w:val="21"/>
-              </w:rPr>
-              <w:t>a)</w:t>
-            </w:r>
-            <w:r>
-              <w:rPr>
-                <w:rFonts w:ascii="Times New Roman" w:hAnsi="Times New Roman"/>
-                <w:b w:val="0"/>
-                <w:i w:val="0"/>
-                <w:sz w:val="21"/>
-              </w:rPr>
-              <w:t xml:space="preserve"> Thuỷ phân saccharose và maltose chỉ thu được một monosaccharide duy nhất.</w:t>
-            </w:r>
-          </w:p>
-        </w:tc>
-        <w:tc>
-          <w:tcPr>
-            <w:tcW w:type="dxa" w:w="1417"/>
-          </w:tcPr>
-          <w:p>
-            <w:pPr>
-              <w:spacing w:before="20" w:after="20"/>
-              <w:jc w:val="center"/>
-            </w:pPr>
-            <w:r>
-              <w:rPr>
-                <w:rFonts w:ascii="Times New Roman" w:hAnsi="Times New Roman"/>
-                <w:b w:val="0"/>
-                <w:i w:val="0"/>
-                <w:color w:val="616161"/>
-                <w:sz w:val="20"/>
-              </w:rPr>
-              <w:t>[ Đúng / Sai ]</w:t>
-            </w:r>
-          </w:p>
-        </w:tc>
-      </w:tr>
-      <w:tr>
-        <w:tc>
-          <w:tcPr>
-            <w:tcW w:type="dxa" w:w="8787"/>
-          </w:tcPr>
-          <w:p>
-            <w:pPr>
-              <w:spacing w:before="20" w:after="20"/>
-            </w:pPr>
-            <w:r>
-              <w:rPr>
-                <w:rFonts w:ascii="Times New Roman" w:hAnsi="Times New Roman"/>
-                <w:b/>
-                <w:i w:val="0"/>
-                <w:sz w:val="21"/>
-              </w:rPr>
-              <w:t>b)</w:t>
-            </w:r>
-            <w:r>
-              <w:rPr>
-                <w:rFonts w:ascii="Times New Roman" w:hAnsi="Times New Roman"/>
-                <w:b w:val="0"/>
-                <w:i w:val="0"/>
-                <w:sz w:val="21"/>
-              </w:rPr>
-              <w:t xml:space="preserve"> Glucose và Fructose đều có thể mở vòng thành dạng mạch hở.</w:t>
-            </w:r>
-          </w:p>
-        </w:tc>
-        <w:tc>
-          <w:tcPr>
-            <w:tcW w:type="dxa" w:w="1417"/>
-          </w:tcPr>
-          <w:p>
-            <w:pPr>
-              <w:spacing w:before="20" w:after="20"/>
-              <w:jc w:val="center"/>
-            </w:pPr>
-            <w:r>
-              <w:rPr>
-                <w:rFonts w:ascii="Times New Roman" w:hAnsi="Times New Roman"/>
-                <w:b w:val="0"/>
-                <w:i w:val="0"/>
-                <w:color w:val="616161"/>
-                <w:sz w:val="20"/>
-              </w:rPr>
-              <w:t>[ Đúng / Sai ]</w:t>
-            </w:r>
-          </w:p>
-        </w:tc>
-      </w:tr>
-      <w:tr>
-        <w:tc>
-          <w:tcPr>
-            <w:tcW w:type="dxa" w:w="8787"/>
-          </w:tcPr>
-          <w:p>
-            <w:pPr>
-              <w:spacing w:before="20" w:after="20"/>
-            </w:pPr>
-            <w:r>
-              <w:rPr>
-                <w:rFonts w:ascii="Times New Roman" w:hAnsi="Times New Roman"/>
-                <w:b/>
-                <w:i w:val="0"/>
-                <w:sz w:val="21"/>
-              </w:rPr>
-              <w:t>c)</w:t>
-            </w:r>
-            <w:r>
-              <w:rPr>
-                <w:rFonts w:ascii="Times New Roman" w:hAnsi="Times New Roman"/>
-                <w:b w:val="0"/>
-                <w:i w:val="0"/>
-                <w:sz w:val="21"/>
-              </w:rPr>
-              <w:t xml:space="preserve"> Glucose và fructose là đồng phân của nhau.</w:t>
-            </w:r>
-          </w:p>
-        </w:tc>
-        <w:tc>
-          <w:tcPr>
-            <w:tcW w:type="dxa" w:w="1417"/>
-          </w:tcPr>
-          <w:p>
-            <w:pPr>
-              <w:spacing w:before="20" w:after="20"/>
-              <w:jc w:val="center"/>
-            </w:pPr>
-            <w:r>
-              <w:rPr>
-                <w:rFonts w:ascii="Times New Roman" w:hAnsi="Times New Roman"/>
-                <w:b w:val="0"/>
-                <w:i w:val="0"/>
-                <w:color w:val="616161"/>
-                <w:sz w:val="20"/>
-              </w:rPr>
-              <w:t>[ Đúng / Sai ]</w:t>
-            </w:r>
-          </w:p>
-        </w:tc>
-      </w:tr>
-      <w:tr>
-        <w:tc>
-          <w:tcPr>
-            <w:tcW w:type="dxa" w:w="8787"/>
-          </w:tcPr>
-          <w:p>
-            <w:pPr>
-              <w:spacing w:before="20" w:after="20"/>
-            </w:pPr>
-            <w:r>
-              <w:rPr>
-                <w:rFonts w:ascii="Times New Roman" w:hAnsi="Times New Roman"/>
-                <w:b/>
-                <w:i w:val="0"/>
-                <w:sz w:val="21"/>
-              </w:rPr>
-              <w:t>d)</w:t>
-            </w:r>
-            <w:r>
-              <w:rPr>
-                <w:rFonts w:ascii="Times New Roman" w:hAnsi="Times New Roman"/>
-                <w:b w:val="0"/>
-                <w:i w:val="0"/>
-                <w:sz w:val="21"/>
-              </w:rPr>
-              <w:t xml:space="preserve"> Thuỷ phân 1 tấn tinh bột thu được 10 tấn glucose. Hiệu suất thuỷ phân tinh bột đạt 80%.</w:t>
-            </w:r>
-          </w:p>
-        </w:tc>
-        <w:tc>
-          <w:tcPr>
-            <w:tcW w:type="dxa" w:w="1417"/>
-          </w:tcPr>
-          <w:p>
-            <w:pPr>
-              <w:spacing w:before="20" w:after="20"/>
-              <w:jc w:val="center"/>
-            </w:pPr>
-            <w:r>
-              <w:rPr>
-                <w:rFonts w:ascii="Times New Roman" w:hAnsi="Times New Roman"/>
-                <w:b w:val="0"/>
-                <w:i w:val="0"/>
-                <w:color w:val="616161"/>
-                <w:sz w:val="20"/>
-              </w:rPr>
-              <w:t>[ Đúng / Sai ]</w:t>
-            </w:r>
-          </w:p>
-        </w:tc>
-      </w:tr>
-    </w:tbl>
+    <w:p>
+      <w:pPr>
+        <w:spacing w:before="20" w:after="20"/>
+        <w:ind w:left="283"/>
+      </w:pPr>
+      <w:r>
+        <w:rPr>
+          <w:rFonts w:ascii="Times New Roman" w:hAnsi="Times New Roman"/>
+          <w:b/>
+          <w:i w:val="0"/>
+          <w:sz w:val="21"/>
+        </w:rPr>
+        <w:t>a)</w:t>
+      </w:r>
+      <w:r>
+        <w:rPr>
+          <w:rFonts w:ascii="Times New Roman" w:hAnsi="Times New Roman"/>
+          <w:b w:val="0"/>
+          <w:i w:val="0"/>
+          <w:sz w:val="21"/>
+        </w:rPr>
+        <w:t xml:space="preserve"> Thuỷ phân saccharose và maltose chỉ thu được một monosaccharide duy nhất.</w:t>
+      </w:r>
+      <w:r>
+        <w:rPr>
+          <w:rFonts w:ascii="Times New Roman" w:hAnsi="Times New Roman"/>
+          <w:b w:val="0"/>
+          <w:i/>
+          <w:color w:val="616161"/>
+          <w:sz w:val="20"/>
+        </w:rPr>
+        <w:t xml:space="preserve">   [ Đúng / Sai ]</w:t>
+      </w:r>
+    </w:p>
+    <w:p>
+      <w:pPr>
+        <w:spacing w:before="20" w:after="20"/>
+        <w:ind w:left="283"/>
+      </w:pPr>
+      <w:r>
+        <w:rPr>
+          <w:rFonts w:ascii="Times New Roman" w:hAnsi="Times New Roman"/>
+          <w:b/>
+          <w:i w:val="0"/>
+          <w:sz w:val="21"/>
+        </w:rPr>
+        <w:t>b)</w:t>
+      </w:r>
+      <w:r>
+        <w:rPr>
+          <w:rFonts w:ascii="Times New Roman" w:hAnsi="Times New Roman"/>
+          <w:b w:val="0"/>
+          <w:i w:val="0"/>
+          <w:sz w:val="21"/>
+        </w:rPr>
+        <w:t xml:space="preserve"> Glucose và Fructose đều có thể mở vòng thành dạng mạch hở.</w:t>
+      </w:r>
+      <w:r>
+        <w:rPr>
+          <w:rFonts w:ascii="Times New Roman" w:hAnsi="Times New Roman"/>
+          <w:b w:val="0"/>
+          <w:i/>
+          <w:color w:val="616161"/>
+          <w:sz w:val="20"/>
+        </w:rPr>
+        <w:t xml:space="preserve">   [ Đúng / Sai ]</w:t>
+      </w:r>
+    </w:p>
+    <w:p>
+      <w:pPr>
+        <w:spacing w:before="20" w:after="20"/>
+        <w:ind w:left="283"/>
+      </w:pPr>
+      <w:r>
+        <w:rPr>
+          <w:rFonts w:ascii="Times New Roman" w:hAnsi="Times New Roman"/>
+          <w:b/>
+          <w:i w:val="0"/>
+          <w:sz w:val="21"/>
+        </w:rPr>
+        <w:t>c)</w:t>
+      </w:r>
+      <w:r>
+        <w:rPr>
+          <w:rFonts w:ascii="Times New Roman" w:hAnsi="Times New Roman"/>
+          <w:b w:val="0"/>
+          <w:i w:val="0"/>
+          <w:sz w:val="21"/>
+        </w:rPr>
+        <w:t xml:space="preserve"> Glucose và fructose là đồng phân của nhau.</w:t>
+      </w:r>
+      <w:r>
+        <w:rPr>
+          <w:rFonts w:ascii="Times New Roman" w:hAnsi="Times New Roman"/>
+          <w:b w:val="0"/>
+          <w:i/>
+          <w:color w:val="616161"/>
+          <w:sz w:val="20"/>
+        </w:rPr>
+        <w:t xml:space="preserve">   [ Đúng / Sai ]</w:t>
+      </w:r>
+    </w:p>
+    <w:p>
+      <w:pPr>
+        <w:spacing w:before="20" w:after="20"/>
+        <w:ind w:left="283"/>
+      </w:pPr>
+      <w:r>
+        <w:rPr>
+          <w:rFonts w:ascii="Times New Roman" w:hAnsi="Times New Roman"/>
+          <w:b/>
+          <w:i w:val="0"/>
+          <w:sz w:val="21"/>
+        </w:rPr>
+        <w:t>d)</w:t>
+      </w:r>
+      <w:r>
+        <w:rPr>
+          <w:rFonts w:ascii="Times New Roman" w:hAnsi="Times New Roman"/>
+          <w:b w:val="0"/>
+          <w:i w:val="0"/>
+          <w:sz w:val="21"/>
+        </w:rPr>
+        <w:t xml:space="preserve"> Thuỷ phân 1 tấn tinh bột thu được 10 tấn glucose. Hiệu suất thuỷ phân tinh bột đạt 80%.</w:t>
+      </w:r>
+      <w:r>
+        <w:rPr>
+          <w:rFonts w:ascii="Times New Roman" w:hAnsi="Times New Roman"/>
+          <w:b w:val="0"/>
+          <w:i/>
+          <w:color w:val="616161"/>
+          <w:sz w:val="20"/>
+        </w:rPr>
+        <w:t xml:space="preserve">   [ Đúng / Sai ]</w:t>
+      </w:r>
+    </w:p>
     <w:p>
       <w:pPr>
         <w:spacing w:before="120" w:after="40"/>
@@ -3850,6 +3298,7 @@
     <w:p>
       <w:pPr>
         <w:spacing w:before="20" w:after="40"/>
+        <w:ind w:left="283"/>
       </w:pPr>
       <w:r>
         <w:rPr>
@@ -4118,6 +3567,7 @@
     <w:p>
       <w:pPr>
         <w:spacing w:before="20" w:after="40"/>
+        <w:ind w:left="283"/>
       </w:pPr>
       <w:r>
         <w:rPr>
@@ -4213,6 +3663,7 @@
     <w:p>
       <w:pPr>
         <w:spacing w:before="20" w:after="40"/>
+        <w:ind w:left="283"/>
       </w:pPr>
       <w:r>
         <w:rPr>
@@ -4289,6 +3740,7 @@
     <w:p>
       <w:pPr>
         <w:spacing w:before="20" w:after="40"/>
+        <w:ind w:left="283"/>
       </w:pPr>
       <w:r>
         <w:rPr>
@@ -4367,6 +3819,7 @@
     <w:p>
       <w:pPr>
         <w:spacing w:before="20" w:after="40"/>
+        <w:ind w:left="283"/>
       </w:pPr>
       <w:r>
         <w:rPr>
@@ -4405,6 +3858,7 @@
     <w:p>
       <w:pPr>
         <w:spacing w:before="20" w:after="40"/>
+        <w:ind w:left="283"/>
       </w:pPr>
       <w:r>
         <w:rPr>
@@ -4470,6 +3924,7 @@
     <w:p>
       <w:pPr>
         <w:spacing w:before="20" w:after="40"/>
+        <w:ind w:left="283"/>
       </w:pPr>
       <w:r>
         <w:rPr>
@@ -4554,6 +4009,7 @@
     <w:p>
       <w:pPr>
         <w:spacing w:before="20" w:after="40"/>
+        <w:ind w:left="283"/>
       </w:pPr>
       <w:r>
         <w:rPr>
@@ -4666,6 +4122,7 @@
     <w:p>
       <w:pPr>
         <w:spacing w:before="40" w:after="80"/>
+        <w:ind w:left="283"/>
       </w:pPr>
       <w:r>
         <w:rPr>
@@ -4712,6 +4169,7 @@
     <w:p>
       <w:pPr>
         <w:spacing w:before="40" w:after="80"/>
+        <w:ind w:left="283"/>
       </w:pPr>
       <w:r>
         <w:rPr>
@@ -4760,6 +4218,7 @@
     <w:p>
       <w:pPr>
         <w:spacing w:before="40" w:after="80"/>
+        <w:ind w:left="283"/>
       </w:pPr>
       <w:r>
         <w:rPr>
@@ -5345,15 +4804,7 @@
     <w:name w:val="Normal"/>
     <w:qFormat/>
     <w:rsid w:val="00FC693F"/>
-    <w:pPr>
-      <w:tabs>
-        <w:tab w:pos="283" w:val="left"/>
-        <w:tab w:pos="850" w:val="left"/>
-        <w:tab w:pos="2835" w:val="left"/>
-        <w:tab w:pos="5386" w:val="left"/>
-        <w:tab w:pos="7937" w:val="left"/>
-      </w:tabs>
-    </w:pPr>
+    <w:pPr/>
   </w:style>
   <w:style w:type="paragraph" w:styleId="Header">
     <w:name w:val="header"/>

</xml_diff>

<commit_message>
Ve lai do hoa vector sac net cho cong thuc Haworth Cau 4 va cap nhat file docx, pdf Ma de 485
</commit_message>
<xml_diff>
--- a/San_Pham/De_Kiem_Tra_Hoa_12_Ma485.docx
+++ b/San_Pham/De_Kiem_Tra_Hoa_12_Ma485.docx
@@ -900,7 +900,7 @@
       <w:r>
         <w:drawing>
           <wp:inline xmlns:a="http://schemas.openxmlformats.org/drawingml/2006/main" xmlns:pic="http://schemas.openxmlformats.org/drawingml/2006/picture">
-            <wp:extent cx="5220000" cy="844412"/>
+            <wp:extent cx="5220000" cy="1383984"/>
             <wp:docPr id="1" name="Picture 1"/>
             <wp:cNvGraphicFramePr>
               <a:graphicFrameLocks noChangeAspect="1"/>
@@ -921,7 +921,7 @@
                   <pic:spPr>
                     <a:xfrm>
                       <a:off x="0" y="0"/>
-                      <a:ext cx="5220000" cy="844412"/>
+                      <a:ext cx="5220000" cy="1383984"/>
                     </a:xfrm>
                     <a:prstGeom prst="rect"/>
                   </pic:spPr>

</xml_diff>